<commit_message>
Latest update to the ZSight Tech Integrations documentation
</commit_message>
<xml_diff>
--- a/2026/ZSIGHT/Tech Integration/DigDev_ZSight_Tech_Integrations_and_Data_Flows_v1.0.docx
+++ b/2026/ZSIGHT/Tech Integration/DigDev_ZSight_Tech_Integrations_and_Data_Flows_v1.0.docx
@@ -349,7 +349,7 @@
           <w:r>
             <w:fldChar w:fldCharType="separate"/>
           </w:r>
-          <w:hyperlink w:anchor="_Toc240789684" w:history="1">
+          <w:hyperlink w:anchor="_Toc241003233" w:history="1">
             <w:r>
               <w:rPr>
                 <w:rStyle w:val="Hyperlink"/>
@@ -388,7 +388,7 @@
               <w:rPr>
                 <w:webHidden/>
               </w:rPr>
-              <w:instrText xml:space="preserve"> PAGEREF _Toc240789684 \h </w:instrText>
+              <w:instrText xml:space="preserve"> PAGEREF _Toc241003233 \h </w:instrText>
             </w:r>
             <w:r>
               <w:rPr>
@@ -429,7 +429,7 @@
               <w:szCs w:val="24"/>
             </w:rPr>
           </w:pPr>
-          <w:hyperlink w:anchor="_Toc240789685" w:history="1">
+          <w:hyperlink w:anchor="_Toc241003234" w:history="1">
             <w:r>
               <w:rPr>
                 <w:rStyle w:val="Hyperlink"/>
@@ -472,7 +472,7 @@
                 <w:noProof/>
                 <w:webHidden/>
               </w:rPr>
-              <w:instrText xml:space="preserve"> PAGEREF _Toc240789685 \h </w:instrText>
+              <w:instrText xml:space="preserve"> PAGEREF _Toc241003234 \h </w:instrText>
             </w:r>
             <w:r>
               <w:rPr>
@@ -517,7 +517,7 @@
               <w:szCs w:val="24"/>
             </w:rPr>
           </w:pPr>
-          <w:hyperlink w:anchor="_Toc240789686" w:history="1">
+          <w:hyperlink w:anchor="_Toc241003235" w:history="1">
             <w:r>
               <w:rPr>
                 <w:rStyle w:val="Hyperlink"/>
@@ -560,7 +560,7 @@
                 <w:noProof/>
                 <w:webHidden/>
               </w:rPr>
-              <w:instrText xml:space="preserve"> PAGEREF _Toc240789686 \h </w:instrText>
+              <w:instrText xml:space="preserve"> PAGEREF _Toc241003235 \h </w:instrText>
             </w:r>
             <w:r>
               <w:rPr>
@@ -605,7 +605,7 @@
               <w:szCs w:val="24"/>
             </w:rPr>
           </w:pPr>
-          <w:hyperlink w:anchor="_Toc240789687" w:history="1">
+          <w:hyperlink w:anchor="_Toc241003236" w:history="1">
             <w:r>
               <w:rPr>
                 <w:rStyle w:val="Hyperlink"/>
@@ -648,7 +648,7 @@
                 <w:noProof/>
                 <w:webHidden/>
               </w:rPr>
-              <w:instrText xml:space="preserve"> PAGEREF _Toc240789687 \h </w:instrText>
+              <w:instrText xml:space="preserve"> PAGEREF _Toc241003236 \h </w:instrText>
             </w:r>
             <w:r>
               <w:rPr>
@@ -690,7 +690,7 @@
               <w:szCs w:val="24"/>
             </w:rPr>
           </w:pPr>
-          <w:hyperlink w:anchor="_Toc240789688" w:history="1">
+          <w:hyperlink w:anchor="_Toc241003237" w:history="1">
             <w:r>
               <w:rPr>
                 <w:rStyle w:val="Hyperlink"/>
@@ -729,7 +729,7 @@
               <w:rPr>
                 <w:webHidden/>
               </w:rPr>
-              <w:instrText xml:space="preserve"> PAGEREF _Toc240789688 \h </w:instrText>
+              <w:instrText xml:space="preserve"> PAGEREF _Toc241003237 \h </w:instrText>
             </w:r>
             <w:r>
               <w:rPr>
@@ -770,7 +770,7 @@
               <w:szCs w:val="24"/>
             </w:rPr>
           </w:pPr>
-          <w:hyperlink w:anchor="_Toc240789689" w:history="1">
+          <w:hyperlink w:anchor="_Toc241003238" w:history="1">
             <w:r>
               <w:rPr>
                 <w:rStyle w:val="Hyperlink"/>
@@ -813,7 +813,7 @@
                 <w:noProof/>
                 <w:webHidden/>
               </w:rPr>
-              <w:instrText xml:space="preserve"> PAGEREF _Toc240789689 \h </w:instrText>
+              <w:instrText xml:space="preserve"> PAGEREF _Toc241003238 \h </w:instrText>
             </w:r>
             <w:r>
               <w:rPr>
@@ -858,7 +858,7 @@
               <w:szCs w:val="24"/>
             </w:rPr>
           </w:pPr>
-          <w:hyperlink w:anchor="_Toc240789690" w:history="1">
+          <w:hyperlink w:anchor="_Toc241003239" w:history="1">
             <w:r>
               <w:rPr>
                 <w:rStyle w:val="Hyperlink"/>
@@ -901,7 +901,7 @@
                 <w:noProof/>
                 <w:webHidden/>
               </w:rPr>
-              <w:instrText xml:space="preserve"> PAGEREF _Toc240789690 \h </w:instrText>
+              <w:instrText xml:space="preserve"> PAGEREF _Toc241003239 \h </w:instrText>
             </w:r>
             <w:r>
               <w:rPr>
@@ -946,7 +946,7 @@
               <w:szCs w:val="24"/>
             </w:rPr>
           </w:pPr>
-          <w:hyperlink w:anchor="_Toc240789691" w:history="1">
+          <w:hyperlink w:anchor="_Toc241003240" w:history="1">
             <w:r>
               <w:rPr>
                 <w:rStyle w:val="Hyperlink"/>
@@ -989,7 +989,7 @@
                 <w:noProof/>
                 <w:webHidden/>
               </w:rPr>
-              <w:instrText xml:space="preserve"> PAGEREF _Toc240789691 \h </w:instrText>
+              <w:instrText xml:space="preserve"> PAGEREF _Toc241003240 \h </w:instrText>
             </w:r>
             <w:r>
               <w:rPr>
@@ -1034,7 +1034,7 @@
               <w:szCs w:val="24"/>
             </w:rPr>
           </w:pPr>
-          <w:hyperlink w:anchor="_Toc240789692" w:history="1">
+          <w:hyperlink w:anchor="_Toc241003241" w:history="1">
             <w:r>
               <w:rPr>
                 <w:rStyle w:val="Hyperlink"/>
@@ -1077,7 +1077,7 @@
                 <w:noProof/>
                 <w:webHidden/>
               </w:rPr>
-              <w:instrText xml:space="preserve"> PAGEREF _Toc240789692 \h </w:instrText>
+              <w:instrText xml:space="preserve"> PAGEREF _Toc241003241 \h </w:instrText>
             </w:r>
             <w:r>
               <w:rPr>
@@ -1122,7 +1122,7 @@
               <w:szCs w:val="24"/>
             </w:rPr>
           </w:pPr>
-          <w:hyperlink w:anchor="_Toc240789693" w:history="1">
+          <w:hyperlink w:anchor="_Toc241003242" w:history="1">
             <w:r>
               <w:rPr>
                 <w:rStyle w:val="Hyperlink"/>
@@ -1165,7 +1165,7 @@
                 <w:noProof/>
                 <w:webHidden/>
               </w:rPr>
-              <w:instrText xml:space="preserve"> PAGEREF _Toc240789693 \h </w:instrText>
+              <w:instrText xml:space="preserve"> PAGEREF _Toc241003242 \h </w:instrText>
             </w:r>
             <w:r>
               <w:rPr>
@@ -1207,7 +1207,7 @@
               <w:szCs w:val="24"/>
             </w:rPr>
           </w:pPr>
-          <w:hyperlink w:anchor="_Toc240789694" w:history="1">
+          <w:hyperlink w:anchor="_Toc241003243" w:history="1">
             <w:r>
               <w:rPr>
                 <w:rStyle w:val="Hyperlink"/>
@@ -1246,7 +1246,7 @@
               <w:rPr>
                 <w:webHidden/>
               </w:rPr>
-              <w:instrText xml:space="preserve"> PAGEREF _Toc240789694 \h </w:instrText>
+              <w:instrText xml:space="preserve"> PAGEREF _Toc241003243 \h </w:instrText>
             </w:r>
             <w:r>
               <w:rPr>
@@ -1287,7 +1287,7 @@
               <w:szCs w:val="24"/>
             </w:rPr>
           </w:pPr>
-          <w:hyperlink w:anchor="_Toc240789695" w:history="1">
+          <w:hyperlink w:anchor="_Toc241003244" w:history="1">
             <w:r>
               <w:rPr>
                 <w:rStyle w:val="Hyperlink"/>
@@ -1330,7 +1330,7 @@
                 <w:noProof/>
                 <w:webHidden/>
               </w:rPr>
-              <w:instrText xml:space="preserve"> PAGEREF _Toc240789695 \h </w:instrText>
+              <w:instrText xml:space="preserve"> PAGEREF _Toc241003244 \h </w:instrText>
             </w:r>
             <w:r>
               <w:rPr>
@@ -1372,7 +1372,7 @@
               <w:szCs w:val="24"/>
             </w:rPr>
           </w:pPr>
-          <w:hyperlink w:anchor="_Toc240789696" w:history="1">
+          <w:hyperlink w:anchor="_Toc241003245" w:history="1">
             <w:r>
               <w:rPr>
                 <w:rStyle w:val="Hyperlink"/>
@@ -1411,7 +1411,7 @@
               <w:rPr>
                 <w:webHidden/>
               </w:rPr>
-              <w:instrText xml:space="preserve"> PAGEREF _Toc240789696 \h </w:instrText>
+              <w:instrText xml:space="preserve"> PAGEREF _Toc241003245 \h </w:instrText>
             </w:r>
             <w:r>
               <w:rPr>
@@ -1449,7 +1449,7 @@
               <w:szCs w:val="24"/>
             </w:rPr>
           </w:pPr>
-          <w:hyperlink w:anchor="_Toc240789697" w:history="1">
+          <w:hyperlink w:anchor="_Toc241003246" w:history="1">
             <w:r>
               <w:rPr>
                 <w:rStyle w:val="Hyperlink"/>
@@ -1488,7 +1488,7 @@
               <w:rPr>
                 <w:webHidden/>
               </w:rPr>
-              <w:instrText xml:space="preserve"> PAGEREF _Toc240789697 \h </w:instrText>
+              <w:instrText xml:space="preserve"> PAGEREF _Toc241003246 \h </w:instrText>
             </w:r>
             <w:r>
               <w:rPr>
@@ -1529,7 +1529,7 @@
               <w:szCs w:val="24"/>
             </w:rPr>
           </w:pPr>
-          <w:hyperlink w:anchor="_Toc240789698" w:history="1">
+          <w:hyperlink w:anchor="_Toc241003247" w:history="1">
             <w:r>
               <w:rPr>
                 <w:rStyle w:val="Hyperlink"/>
@@ -1572,7 +1572,7 @@
                 <w:noProof/>
                 <w:webHidden/>
               </w:rPr>
-              <w:instrText xml:space="preserve"> PAGEREF _Toc240789698 \h </w:instrText>
+              <w:instrText xml:space="preserve"> PAGEREF _Toc241003247 \h </w:instrText>
             </w:r>
             <w:r>
               <w:rPr>
@@ -1617,7 +1617,7 @@
               <w:szCs w:val="24"/>
             </w:rPr>
           </w:pPr>
-          <w:hyperlink w:anchor="_Toc240789699" w:history="1">
+          <w:hyperlink w:anchor="_Toc241003248" w:history="1">
             <w:r>
               <w:rPr>
                 <w:rStyle w:val="Hyperlink"/>
@@ -1660,7 +1660,7 @@
                 <w:noProof/>
                 <w:webHidden/>
               </w:rPr>
-              <w:instrText xml:space="preserve"> PAGEREF _Toc240789699 \h </w:instrText>
+              <w:instrText xml:space="preserve"> PAGEREF _Toc241003248 \h </w:instrText>
             </w:r>
             <w:r>
               <w:rPr>
@@ -1705,7 +1705,7 @@
               <w:szCs w:val="24"/>
             </w:rPr>
           </w:pPr>
-          <w:hyperlink w:anchor="_Toc240789700" w:history="1">
+          <w:hyperlink w:anchor="_Toc241003249" w:history="1">
             <w:r>
               <w:rPr>
                 <w:rStyle w:val="Hyperlink"/>
@@ -1748,7 +1748,7 @@
                 <w:noProof/>
                 <w:webHidden/>
               </w:rPr>
-              <w:instrText xml:space="preserve"> PAGEREF _Toc240789700 \h </w:instrText>
+              <w:instrText xml:space="preserve"> PAGEREF _Toc241003249 \h </w:instrText>
             </w:r>
             <w:r>
               <w:rPr>
@@ -1790,7 +1790,7 @@
               <w:szCs w:val="24"/>
             </w:rPr>
           </w:pPr>
-          <w:hyperlink w:anchor="_Toc240789701" w:history="1">
+          <w:hyperlink w:anchor="_Toc241003250" w:history="1">
             <w:r>
               <w:rPr>
                 <w:rStyle w:val="Hyperlink"/>
@@ -1829,7 +1829,7 @@
               <w:rPr>
                 <w:webHidden/>
               </w:rPr>
-              <w:instrText xml:space="preserve"> PAGEREF _Toc240789701 \h </w:instrText>
+              <w:instrText xml:space="preserve"> PAGEREF _Toc241003250 \h </w:instrText>
             </w:r>
             <w:r>
               <w:rPr>
@@ -1870,7 +1870,7 @@
               <w:szCs w:val="24"/>
             </w:rPr>
           </w:pPr>
-          <w:hyperlink w:anchor="_Toc240789702" w:history="1">
+          <w:hyperlink w:anchor="_Toc241003251" w:history="1">
             <w:r>
               <w:rPr>
                 <w:rStyle w:val="Hyperlink"/>
@@ -1913,7 +1913,7 @@
                 <w:noProof/>
                 <w:webHidden/>
               </w:rPr>
-              <w:instrText xml:space="preserve"> PAGEREF _Toc240789702 \h </w:instrText>
+              <w:instrText xml:space="preserve"> PAGEREF _Toc241003251 \h </w:instrText>
             </w:r>
             <w:r>
               <w:rPr>
@@ -1958,7 +1958,7 @@
               <w:szCs w:val="24"/>
             </w:rPr>
           </w:pPr>
-          <w:hyperlink w:anchor="_Toc240789703" w:history="1">
+          <w:hyperlink w:anchor="_Toc241003252" w:history="1">
             <w:r>
               <w:rPr>
                 <w:rStyle w:val="Hyperlink"/>
@@ -2001,7 +2001,7 @@
                 <w:noProof/>
                 <w:webHidden/>
               </w:rPr>
-              <w:instrText xml:space="preserve"> PAGEREF _Toc240789703 \h </w:instrText>
+              <w:instrText xml:space="preserve"> PAGEREF _Toc241003252 \h </w:instrText>
             </w:r>
             <w:r>
               <w:rPr>
@@ -2046,7 +2046,7 @@
               <w:szCs w:val="24"/>
             </w:rPr>
           </w:pPr>
-          <w:hyperlink w:anchor="_Toc240789704" w:history="1">
+          <w:hyperlink w:anchor="_Toc241003253" w:history="1">
             <w:r>
               <w:rPr>
                 <w:rStyle w:val="Hyperlink"/>
@@ -2089,7 +2089,7 @@
                 <w:noProof/>
                 <w:webHidden/>
               </w:rPr>
-              <w:instrText xml:space="preserve"> PAGEREF _Toc240789704 \h </w:instrText>
+              <w:instrText xml:space="preserve"> PAGEREF _Toc241003253 \h </w:instrText>
             </w:r>
             <w:r>
               <w:rPr>
@@ -2131,7 +2131,7 @@
               <w:szCs w:val="24"/>
             </w:rPr>
           </w:pPr>
-          <w:hyperlink w:anchor="_Toc240789705" w:history="1">
+          <w:hyperlink w:anchor="_Toc241003254" w:history="1">
             <w:r>
               <w:rPr>
                 <w:rStyle w:val="Hyperlink"/>
@@ -2170,7 +2170,7 @@
               <w:rPr>
                 <w:webHidden/>
               </w:rPr>
-              <w:instrText xml:space="preserve"> PAGEREF _Toc240789705 \h </w:instrText>
+              <w:instrText xml:space="preserve"> PAGEREF _Toc241003254 \h </w:instrText>
             </w:r>
             <w:r>
               <w:rPr>
@@ -2208,7 +2208,7 @@
               <w:szCs w:val="24"/>
             </w:rPr>
           </w:pPr>
-          <w:hyperlink w:anchor="_Toc240789706" w:history="1">
+          <w:hyperlink w:anchor="_Toc241003255" w:history="1">
             <w:r>
               <w:rPr>
                 <w:rStyle w:val="Hyperlink"/>
@@ -2247,7 +2247,7 @@
               <w:rPr>
                 <w:webHidden/>
               </w:rPr>
-              <w:instrText xml:space="preserve"> PAGEREF _Toc240789706 \h </w:instrText>
+              <w:instrText xml:space="preserve"> PAGEREF _Toc241003255 \h </w:instrText>
             </w:r>
             <w:r>
               <w:rPr>
@@ -2285,7 +2285,7 @@
               <w:szCs w:val="24"/>
             </w:rPr>
           </w:pPr>
-          <w:hyperlink w:anchor="_Toc240789707" w:history="1">
+          <w:hyperlink w:anchor="_Toc241003256" w:history="1">
             <w:r>
               <w:rPr>
                 <w:rStyle w:val="Hyperlink"/>
@@ -2306,6 +2306,413 @@
               <w:rPr>
                 <w:rStyle w:val="Hyperlink"/>
               </w:rPr>
+              <w:t>ONGOING ENTITY UPDATES</w:t>
+            </w:r>
+            <w:r>
+              <w:rPr>
+                <w:webHidden/>
+              </w:rPr>
+              <w:tab/>
+            </w:r>
+            <w:r>
+              <w:rPr>
+                <w:webHidden/>
+              </w:rPr>
+              <w:fldChar w:fldCharType="begin"/>
+            </w:r>
+            <w:r>
+              <w:rPr>
+                <w:webHidden/>
+              </w:rPr>
+              <w:instrText xml:space="preserve"> PAGEREF _Toc241003256 \h </w:instrText>
+            </w:r>
+            <w:r>
+              <w:rPr>
+                <w:webHidden/>
+              </w:rPr>
+            </w:r>
+            <w:r>
+              <w:rPr>
+                <w:webHidden/>
+              </w:rPr>
+              <w:fldChar w:fldCharType="separate"/>
+            </w:r>
+            <w:r>
+              <w:rPr>
+                <w:webHidden/>
+              </w:rPr>
+              <w:t>16</w:t>
+            </w:r>
+            <w:r>
+              <w:rPr>
+                <w:webHidden/>
+              </w:rPr>
+              <w:fldChar w:fldCharType="end"/>
+            </w:r>
+          </w:hyperlink>
+        </w:p>
+        <w:p>
+          <w:pPr>
+            <w:pStyle w:val="TOC2"/>
+            <w:tabs>
+              <w:tab w:val="left" w:pos="960"/>
+              <w:tab w:val="right" w:leader="dot" w:pos="10530"/>
+            </w:tabs>
+            <w:rPr>
+              <w:rFonts w:asciiTheme="minorHAnsi" w:eastAsiaTheme="minorEastAsia" w:hAnsiTheme="minorHAnsi"/>
+              <w:noProof/>
+              <w:sz w:val="24"/>
+              <w:szCs w:val="24"/>
+            </w:rPr>
+          </w:pPr>
+          <w:hyperlink w:anchor="_Toc241003257" w:history="1">
+            <w:r>
+              <w:rPr>
+                <w:rStyle w:val="Hyperlink"/>
+                <w:noProof/>
+              </w:rPr>
+              <w:t>9.1</w:t>
+            </w:r>
+            <w:r>
+              <w:rPr>
+                <w:rFonts w:asciiTheme="minorHAnsi" w:eastAsiaTheme="minorEastAsia" w:hAnsiTheme="minorHAnsi"/>
+                <w:noProof/>
+                <w:sz w:val="24"/>
+                <w:szCs w:val="24"/>
+              </w:rPr>
+              <w:tab/>
+            </w:r>
+            <w:r>
+              <w:rPr>
+                <w:rStyle w:val="Hyperlink"/>
+                <w:noProof/>
+              </w:rPr>
+              <w:t>The 60-second audit-trail guard</w:t>
+            </w:r>
+            <w:r>
+              <w:rPr>
+                <w:noProof/>
+                <w:webHidden/>
+              </w:rPr>
+              <w:tab/>
+            </w:r>
+            <w:r>
+              <w:rPr>
+                <w:noProof/>
+                <w:webHidden/>
+              </w:rPr>
+              <w:fldChar w:fldCharType="begin"/>
+            </w:r>
+            <w:r>
+              <w:rPr>
+                <w:noProof/>
+                <w:webHidden/>
+              </w:rPr>
+              <w:instrText xml:space="preserve"> PAGEREF _Toc241003257 \h </w:instrText>
+            </w:r>
+            <w:r>
+              <w:rPr>
+                <w:noProof/>
+                <w:webHidden/>
+              </w:rPr>
+            </w:r>
+            <w:r>
+              <w:rPr>
+                <w:noProof/>
+                <w:webHidden/>
+              </w:rPr>
+              <w:fldChar w:fldCharType="separate"/>
+            </w:r>
+            <w:r>
+              <w:rPr>
+                <w:noProof/>
+                <w:webHidden/>
+              </w:rPr>
+              <w:t>16</w:t>
+            </w:r>
+            <w:r>
+              <w:rPr>
+                <w:noProof/>
+                <w:webHidden/>
+              </w:rPr>
+              <w:fldChar w:fldCharType="end"/>
+            </w:r>
+          </w:hyperlink>
+        </w:p>
+        <w:p>
+          <w:pPr>
+            <w:pStyle w:val="TOC1"/>
+            <w:rPr>
+              <w:rFonts w:asciiTheme="minorHAnsi" w:eastAsiaTheme="minorEastAsia" w:hAnsiTheme="minorHAnsi"/>
+              <w:b w:val="0"/>
+              <w:caps w:val="0"/>
+              <w:sz w:val="24"/>
+              <w:szCs w:val="24"/>
+            </w:rPr>
+          </w:pPr>
+          <w:hyperlink w:anchor="_Toc241003258" w:history="1">
+            <w:r>
+              <w:rPr>
+                <w:rStyle w:val="Hyperlink"/>
+              </w:rPr>
+              <w:t>10</w:t>
+            </w:r>
+            <w:r>
+              <w:rPr>
+                <w:rFonts w:asciiTheme="minorHAnsi" w:eastAsiaTheme="minorEastAsia" w:hAnsiTheme="minorHAnsi"/>
+                <w:b w:val="0"/>
+                <w:caps w:val="0"/>
+                <w:sz w:val="24"/>
+                <w:szCs w:val="24"/>
+              </w:rPr>
+              <w:tab/>
+            </w:r>
+            <w:r>
+              <w:rPr>
+                <w:rStyle w:val="Hyperlink"/>
+              </w:rPr>
+              <w:t>OUTBOUND WRITE TO QUICKBASE</w:t>
+            </w:r>
+            <w:r>
+              <w:rPr>
+                <w:webHidden/>
+              </w:rPr>
+              <w:tab/>
+            </w:r>
+            <w:r>
+              <w:rPr>
+                <w:webHidden/>
+              </w:rPr>
+              <w:fldChar w:fldCharType="begin"/>
+            </w:r>
+            <w:r>
+              <w:rPr>
+                <w:webHidden/>
+              </w:rPr>
+              <w:instrText xml:space="preserve"> PAGEREF _Toc241003258 \h </w:instrText>
+            </w:r>
+            <w:r>
+              <w:rPr>
+                <w:webHidden/>
+              </w:rPr>
+            </w:r>
+            <w:r>
+              <w:rPr>
+                <w:webHidden/>
+              </w:rPr>
+              <w:fldChar w:fldCharType="separate"/>
+            </w:r>
+            <w:r>
+              <w:rPr>
+                <w:webHidden/>
+              </w:rPr>
+              <w:t>17</w:t>
+            </w:r>
+            <w:r>
+              <w:rPr>
+                <w:webHidden/>
+              </w:rPr>
+              <w:fldChar w:fldCharType="end"/>
+            </w:r>
+          </w:hyperlink>
+        </w:p>
+        <w:p>
+          <w:pPr>
+            <w:pStyle w:val="TOC2"/>
+            <w:tabs>
+              <w:tab w:val="left" w:pos="960"/>
+              <w:tab w:val="right" w:leader="dot" w:pos="10530"/>
+            </w:tabs>
+            <w:rPr>
+              <w:rFonts w:asciiTheme="minorHAnsi" w:eastAsiaTheme="minorEastAsia" w:hAnsiTheme="minorHAnsi"/>
+              <w:noProof/>
+              <w:sz w:val="24"/>
+              <w:szCs w:val="24"/>
+            </w:rPr>
+          </w:pPr>
+          <w:hyperlink w:anchor="_Toc241003259" w:history="1">
+            <w:r>
+              <w:rPr>
+                <w:rStyle w:val="Hyperlink"/>
+                <w:noProof/>
+              </w:rPr>
+              <w:t>10.1</w:t>
+            </w:r>
+            <w:r>
+              <w:rPr>
+                <w:rFonts w:asciiTheme="minorHAnsi" w:eastAsiaTheme="minorEastAsia" w:hAnsiTheme="minorHAnsi"/>
+                <w:noProof/>
+                <w:sz w:val="24"/>
+                <w:szCs w:val="24"/>
+              </w:rPr>
+              <w:tab/>
+            </w:r>
+            <w:r>
+              <w:rPr>
+                <w:rStyle w:val="Hyperlink"/>
+                <w:noProof/>
+              </w:rPr>
+              <w:t>Internal events</w:t>
+            </w:r>
+            <w:r>
+              <w:rPr>
+                <w:noProof/>
+                <w:webHidden/>
+              </w:rPr>
+              <w:tab/>
+            </w:r>
+            <w:r>
+              <w:rPr>
+                <w:noProof/>
+                <w:webHidden/>
+              </w:rPr>
+              <w:fldChar w:fldCharType="begin"/>
+            </w:r>
+            <w:r>
+              <w:rPr>
+                <w:noProof/>
+                <w:webHidden/>
+              </w:rPr>
+              <w:instrText xml:space="preserve"> PAGEREF _Toc241003259 \h </w:instrText>
+            </w:r>
+            <w:r>
+              <w:rPr>
+                <w:noProof/>
+                <w:webHidden/>
+              </w:rPr>
+            </w:r>
+            <w:r>
+              <w:rPr>
+                <w:noProof/>
+                <w:webHidden/>
+              </w:rPr>
+              <w:fldChar w:fldCharType="separate"/>
+            </w:r>
+            <w:r>
+              <w:rPr>
+                <w:noProof/>
+                <w:webHidden/>
+              </w:rPr>
+              <w:t>17</w:t>
+            </w:r>
+            <w:r>
+              <w:rPr>
+                <w:noProof/>
+                <w:webHidden/>
+              </w:rPr>
+              <w:fldChar w:fldCharType="end"/>
+            </w:r>
+          </w:hyperlink>
+        </w:p>
+        <w:p>
+          <w:pPr>
+            <w:pStyle w:val="TOC1"/>
+            <w:rPr>
+              <w:rFonts w:asciiTheme="minorHAnsi" w:eastAsiaTheme="minorEastAsia" w:hAnsiTheme="minorHAnsi"/>
+              <w:b w:val="0"/>
+              <w:caps w:val="0"/>
+              <w:sz w:val="24"/>
+              <w:szCs w:val="24"/>
+            </w:rPr>
+          </w:pPr>
+          <w:hyperlink w:anchor="_Toc241003260" w:history="1">
+            <w:r>
+              <w:rPr>
+                <w:rStyle w:val="Hyperlink"/>
+              </w:rPr>
+              <w:t>11</w:t>
+            </w:r>
+            <w:r>
+              <w:rPr>
+                <w:rFonts w:asciiTheme="minorHAnsi" w:eastAsiaTheme="minorEastAsia" w:hAnsiTheme="minorHAnsi"/>
+                <w:b w:val="0"/>
+                <w:caps w:val="0"/>
+                <w:sz w:val="24"/>
+                <w:szCs w:val="24"/>
+              </w:rPr>
+              <w:tab/>
+            </w:r>
+            <w:r>
+              <w:rPr>
+                <w:rStyle w:val="Hyperlink"/>
+              </w:rPr>
+              <w:t>APPENDIX A – JOBS AND COMMANDS OUTSIDE THE INTEGRATION</w:t>
+            </w:r>
+            <w:r>
+              <w:rPr>
+                <w:webHidden/>
+              </w:rPr>
+              <w:tab/>
+            </w:r>
+            <w:r>
+              <w:rPr>
+                <w:webHidden/>
+              </w:rPr>
+              <w:fldChar w:fldCharType="begin"/>
+            </w:r>
+            <w:r>
+              <w:rPr>
+                <w:webHidden/>
+              </w:rPr>
+              <w:instrText xml:space="preserve"> PAGEREF _Toc241003260 \h </w:instrText>
+            </w:r>
+            <w:r>
+              <w:rPr>
+                <w:webHidden/>
+              </w:rPr>
+            </w:r>
+            <w:r>
+              <w:rPr>
+                <w:webHidden/>
+              </w:rPr>
+              <w:fldChar w:fldCharType="separate"/>
+            </w:r>
+            <w:r>
+              <w:rPr>
+                <w:webHidden/>
+              </w:rPr>
+              <w:t>18</w:t>
+            </w:r>
+            <w:r>
+              <w:rPr>
+                <w:webHidden/>
+              </w:rPr>
+              <w:fldChar w:fldCharType="end"/>
+            </w:r>
+          </w:hyperlink>
+        </w:p>
+        <w:p>
+          <w:pPr>
+            <w:pStyle w:val="TOC1"/>
+            <w:rPr>
+              <w:rFonts w:asciiTheme="minorHAnsi" w:eastAsiaTheme="minorEastAsia" w:hAnsiTheme="minorHAnsi"/>
+              <w:b w:val="0"/>
+              <w:caps w:val="0"/>
+              <w:sz w:val="24"/>
+              <w:szCs w:val="24"/>
+            </w:rPr>
+          </w:pPr>
+          <w:hyperlink w:anchor="_Toc241003261" w:history="1">
+            <w:r>
+              <w:rPr>
+                <w:rStyle w:val="Hyperlink"/>
+              </w:rPr>
+              <w:t>12</w:t>
+            </w:r>
+            <w:r>
+              <w:rPr>
+                <w:rFonts w:asciiTheme="minorHAnsi" w:eastAsiaTheme="minorEastAsia" w:hAnsiTheme="minorHAnsi"/>
+                <w:b w:val="0"/>
+                <w:caps w:val="0"/>
+                <w:sz w:val="24"/>
+                <w:szCs w:val="24"/>
+              </w:rPr>
+              <w:tab/>
+            </w:r>
+            <w:r>
+              <w:rPr>
+                <w:rStyle w:val="Hyperlink"/>
+              </w:rPr>
               <w:t>APPROVAL SIGNATURES</w:t>
             </w:r>
             <w:r>
@@ -2324,7 +2731,7 @@
               <w:rPr>
                 <w:webHidden/>
               </w:rPr>
-              <w:instrText xml:space="preserve"> PAGEREF _Toc240789707 \h </w:instrText>
+              <w:instrText xml:space="preserve"> PAGEREF _Toc241003261 \h </w:instrText>
             </w:r>
             <w:r>
               <w:rPr>
@@ -2341,7 +2748,7 @@
               <w:rPr>
                 <w:webHidden/>
               </w:rPr>
-              <w:t>16</w:t>
+              <w:t>19</w:t>
             </w:r>
             <w:r>
               <w:rPr>
@@ -2375,30 +2782,10 @@
     </w:p>
     <w:p>
       <w:pPr>
-        <w:pStyle w:val="NoSpacing"/>
-      </w:pPr>
-    </w:p>
-    <w:p>
-      <w:pPr>
-        <w:pStyle w:val="NoSpacing"/>
-      </w:pPr>
-    </w:p>
-    <w:p>
-      <w:pPr>
-        <w:pStyle w:val="NoSpacing"/>
-      </w:pPr>
-    </w:p>
-    <w:p>
-      <w:pPr>
-        <w:pStyle w:val="NoSpacing"/>
-      </w:pPr>
-    </w:p>
-    <w:p>
-      <w:pPr>
         <w:pStyle w:val="Heading1"/>
         <w:spacing w:after="360"/>
       </w:pPr>
-      <w:bookmarkStart w:id="0" w:name="_Toc240789684"/>
+      <w:bookmarkStart w:id="0" w:name="_Toc241003233"/>
       <w:r>
         <w:lastRenderedPageBreak/>
         <w:t>DOCUMENT INFORMATION</w:t>
@@ -2409,7 +2796,7 @@
       <w:pPr>
         <w:pStyle w:val="Heading2"/>
       </w:pPr>
-      <w:bookmarkStart w:id="1" w:name="_Toc240789685"/>
+      <w:bookmarkStart w:id="1" w:name="_Toc241003234"/>
       <w:r>
         <w:t>Validation</w:t>
       </w:r>
@@ -2947,7 +3334,7 @@
       <w:pPr>
         <w:pStyle w:val="Heading2"/>
       </w:pPr>
-      <w:bookmarkStart w:id="2" w:name="_Toc240789686"/>
+      <w:bookmarkStart w:id="2" w:name="_Toc241003235"/>
       <w:r>
         <w:t>Document Distribution</w:t>
       </w:r>
@@ -3160,7 +3547,7 @@
       <w:pPr>
         <w:pStyle w:val="Heading2"/>
       </w:pPr>
-      <w:bookmarkStart w:id="3" w:name="_Toc240789687"/>
+      <w:bookmarkStart w:id="3" w:name="_Toc241003236"/>
       <w:r>
         <w:t>Version Control</w:t>
       </w:r>
@@ -3596,7 +3983,7 @@
         <w:pStyle w:val="Heading1"/>
         <w:spacing w:after="360"/>
       </w:pPr>
-      <w:bookmarkStart w:id="4" w:name="_Toc240789688"/>
+      <w:bookmarkStart w:id="4" w:name="_Toc241003237"/>
       <w:r>
         <w:lastRenderedPageBreak/>
         <w:t>P</w:t>
@@ -3613,7 +4000,7 @@
       <w:pPr>
         <w:pStyle w:val="Heading2"/>
       </w:pPr>
-      <w:bookmarkStart w:id="5" w:name="_Toc240789689"/>
+      <w:bookmarkStart w:id="5" w:name="_Toc241003238"/>
       <w:r>
         <w:t>About this document</w:t>
       </w:r>
@@ -3761,7 +4148,7 @@
       <w:pPr>
         <w:pStyle w:val="Heading2"/>
       </w:pPr>
-      <w:bookmarkStart w:id="6" w:name="_Toc240789690"/>
+      <w:bookmarkStart w:id="6" w:name="_Toc241003239"/>
       <w:r>
         <w:t>Scope</w:t>
       </w:r>
@@ -4096,7 +4483,7 @@
       <w:pPr>
         <w:pStyle w:val="Heading2"/>
       </w:pPr>
-      <w:bookmarkStart w:id="7" w:name="_Toc240789691"/>
+      <w:bookmarkStart w:id="7" w:name="_Toc241003240"/>
       <w:r>
         <w:t>Roles &amp; Responsibilities</w:t>
       </w:r>
@@ -4535,7 +4922,7 @@
       <w:pPr>
         <w:pStyle w:val="Heading2"/>
       </w:pPr>
-      <w:bookmarkStart w:id="8" w:name="_Toc240789692"/>
+      <w:bookmarkStart w:id="8" w:name="_Toc241003241"/>
       <w:r>
         <w:t>Terminology</w:t>
       </w:r>
@@ -5456,7 +5843,7 @@
       <w:pPr>
         <w:pStyle w:val="Heading2"/>
       </w:pPr>
-      <w:bookmarkStart w:id="9" w:name="_Toc240789693"/>
+      <w:bookmarkStart w:id="9" w:name="_Toc241003242"/>
       <w:r>
         <w:t>Conventions Used</w:t>
       </w:r>
@@ -5718,7 +6105,7 @@
         <w:pStyle w:val="Heading1"/>
         <w:spacing w:after="360"/>
       </w:pPr>
-      <w:bookmarkStart w:id="10" w:name="_Toc240789694"/>
+      <w:bookmarkStart w:id="10" w:name="_Toc241003243"/>
       <w:r>
         <w:lastRenderedPageBreak/>
         <w:t>SYSTEMS IN SCOPE</w:t>
@@ -6156,7 +6543,7 @@
       <w:pPr>
         <w:pStyle w:val="Heading2"/>
       </w:pPr>
-      <w:bookmarkStart w:id="11" w:name="_Toc240789695"/>
+      <w:bookmarkStart w:id="11" w:name="_Toc241003244"/>
       <w:r>
         <w:t>Gating conditions</w:t>
       </w:r>
@@ -6294,7 +6681,7 @@
         <w:pStyle w:val="Heading1"/>
         <w:spacing w:after="360"/>
       </w:pPr>
-      <w:bookmarkStart w:id="12" w:name="_Toc240789696"/>
+      <w:bookmarkStart w:id="12" w:name="_Toc241003245"/>
       <w:r>
         <w:lastRenderedPageBreak/>
         <w:t>OVERALL DATA FLOW</w:t>
@@ -6326,10 +6713,10 @@
           <w:szCs w:val="32"/>
         </w:rPr>
         <w:drawing>
-          <wp:inline distT="0" distB="0" distL="0" distR="0" wp14:anchorId="0F743543" wp14:editId="6280E86B">
-            <wp:extent cx="6692900" cy="2718435"/>
-            <wp:effectExtent l="0" t="0" r="0" b="5715"/>
-            <wp:docPr id="2123188458" name="Picture 1"/>
+          <wp:inline distT="0" distB="0" distL="0" distR="0" wp14:anchorId="66246E92" wp14:editId="763B5375">
+            <wp:extent cx="6692900" cy="2466340"/>
+            <wp:effectExtent l="0" t="0" r="0" b="0"/>
+            <wp:docPr id="1893490797" name="Picture 1"/>
             <wp:cNvGraphicFramePr>
               <a:graphicFrameLocks xmlns:a="http://schemas.openxmlformats.org/drawingml/2006/main" noChangeAspect="1"/>
             </wp:cNvGraphicFramePr>
@@ -6337,7 +6724,7 @@
               <a:graphicData uri="http://schemas.openxmlformats.org/drawingml/2006/picture">
                 <pic:pic xmlns:pic="http://schemas.openxmlformats.org/drawingml/2006/picture">
                   <pic:nvPicPr>
-                    <pic:cNvPr id="2123188458" name=""/>
+                    <pic:cNvPr id="1893490797" name=""/>
                     <pic:cNvPicPr/>
                   </pic:nvPicPr>
                   <pic:blipFill>
@@ -6349,7 +6736,7 @@
                   <pic:spPr>
                     <a:xfrm>
                       <a:off x="0" y="0"/>
-                      <a:ext cx="6692900" cy="2718435"/>
+                      <a:ext cx="6692900" cy="2466340"/>
                     </a:xfrm>
                     <a:prstGeom prst="rect">
                       <a:avLst/>
@@ -6361,17 +6748,6 @@
           </wp:inline>
         </w:drawing>
       </w:r>
-    </w:p>
-    <w:p>
-      <w:pPr>
-        <w:rPr>
-          <w:rFonts w:eastAsiaTheme="majorEastAsia" w:cstheme="majorBidi"/>
-          <w:b/>
-          <w:color w:val="4F7ABA"/>
-          <w:sz w:val="28"/>
-          <w:szCs w:val="32"/>
-        </w:rPr>
-      </w:pPr>
     </w:p>
     <w:p>
       <w:r>
@@ -6399,8 +6775,21 @@
     <w:p>
       <w:pPr>
         <w:pStyle w:val="Heading1"/>
-      </w:pPr>
-      <w:bookmarkStart w:id="13" w:name="_Toc240789697"/>
+        <w:sectPr>
+          <w:headerReference w:type="default" r:id="rId14"/>
+          <w:pgSz w:w="12240" w:h="15840"/>
+          <w:pgMar w:top="1411" w:right="850" w:bottom="1411" w:left="850" w:header="576" w:footer="720" w:gutter="0"/>
+          <w:pgNumType w:chapSep="period"/>
+          <w:cols w:space="720"/>
+          <w:docGrid w:linePitch="360"/>
+        </w:sectPr>
+      </w:pPr>
+    </w:p>
+    <w:p>
+      <w:pPr>
+        <w:pStyle w:val="Heading1"/>
+      </w:pPr>
+      <w:bookmarkStart w:id="13" w:name="_Toc241003246"/>
       <w:r>
         <w:lastRenderedPageBreak/>
         <w:t>API SURFACES</w:t>
@@ -6425,7 +6814,7 @@
       <w:pPr>
         <w:pStyle w:val="Heading2"/>
       </w:pPr>
-      <w:bookmarkStart w:id="14" w:name="_Toc240789698"/>
+      <w:bookmarkStart w:id="14" w:name="_Toc241003247"/>
       <w:proofErr w:type="spellStart"/>
       <w:r>
         <w:t>ZTERS</w:t>
@@ -6438,33 +6827,19 @@
     </w:p>
     <w:p>
       <w:r>
-        <w:t xml:space="preserve">Base path </w:t>
-      </w:r>
-      <w:proofErr w:type="spellStart"/>
-      <w:r>
-        <w:rPr>
-          <w:rFonts w:ascii="Consolas" w:hAnsi="Consolas"/>
-          <w:highlight w:val="lightGray"/>
-        </w:rPr>
-        <w:t>api.zsight.tech</w:t>
-      </w:r>
-      <w:proofErr w:type="spellEnd"/>
-      <w:r>
-        <w:rPr>
-          <w:rFonts w:ascii="Consolas" w:hAnsi="Consolas"/>
-          <w:highlight w:val="lightGray"/>
-        </w:rPr>
-        <w:t>/accounts/</w:t>
-      </w:r>
-      <w:proofErr w:type="spellStart"/>
-      <w:r>
-        <w:rPr>
-          <w:rFonts w:ascii="Consolas" w:hAnsi="Consolas"/>
-          <w:highlight w:val="lightGray"/>
-        </w:rPr>
-        <w:t>zters</w:t>
-      </w:r>
-      <w:proofErr w:type="spellEnd"/>
+        <w:t>Base pat</w:t>
+      </w:r>
+      <w:r>
+        <w:t xml:space="preserve">h </w:t>
+      </w:r>
+      <w:hyperlink r:id="rId15" w:anchor="/" w:history="1">
+        <w:r>
+          <w:rPr>
+            <w:rStyle w:val="Hyperlink"/>
+          </w:rPr>
+          <w:t>https://api.zsight.tech/docs/accounts/zters#/</w:t>
+        </w:r>
+      </w:hyperlink>
       <w:r>
         <w:t xml:space="preserve">. Built specifically for </w:t>
       </w:r>
@@ -6949,7 +7324,7 @@
       <w:pPr>
         <w:pStyle w:val="Heading2"/>
       </w:pPr>
-      <w:bookmarkStart w:id="15" w:name="_Toc240789699"/>
+      <w:bookmarkStart w:id="15" w:name="_Toc241003248"/>
       <w:r>
         <w:t>ZSight API v1 - generic</w:t>
       </w:r>
@@ -6957,24 +7332,19 @@
     </w:p>
     <w:p>
       <w:r>
-        <w:t xml:space="preserve">Base path </w:t>
-      </w:r>
-      <w:proofErr w:type="spellStart"/>
-      <w:r>
-        <w:rPr>
-          <w:rFonts w:ascii="Consolas" w:hAnsi="Consolas"/>
-          <w:highlight w:val="lightGray"/>
-        </w:rPr>
-        <w:t>api.zsight.tech</w:t>
-      </w:r>
-      <w:proofErr w:type="spellEnd"/>
-      <w:r>
-        <w:rPr>
-          <w:rFonts w:ascii="Consolas" w:hAnsi="Consolas"/>
-          <w:highlight w:val="lightGray"/>
-        </w:rPr>
-        <w:t>/v1</w:t>
-      </w:r>
+        <w:t>Base pat</w:t>
+      </w:r>
+      <w:r>
+        <w:t xml:space="preserve">h </w:t>
+      </w:r>
+      <w:hyperlink r:id="rId16" w:anchor="/" w:history="1">
+        <w:r>
+          <w:rPr>
+            <w:rStyle w:val="Hyperlink"/>
+          </w:rPr>
+          <w:t>https://api.zsight.tech/docs/v1#/</w:t>
+        </w:r>
+      </w:hyperlink>
       <w:r>
         <w:t>. The platform's own public API, already partially in place and intended to become the single integration surface for every account. QuickBase uses four of its update operations to keep reference data current.</w:t>
       </w:r>
@@ -7480,7 +7850,7 @@
       <w:pPr>
         <w:pStyle w:val="Heading2"/>
       </w:pPr>
-      <w:bookmarkStart w:id="16" w:name="_Toc240789700"/>
+      <w:bookmarkStart w:id="16" w:name="_Toc241003249"/>
       <w:r>
         <w:t>Tago API - device provider exchange</w:t>
       </w:r>
@@ -7488,33 +7858,19 @@
     </w:p>
     <w:p>
       <w:r>
-        <w:t xml:space="preserve">Base path </w:t>
-      </w:r>
-      <w:proofErr w:type="spellStart"/>
-      <w:r>
-        <w:rPr>
-          <w:rFonts w:ascii="Consolas" w:hAnsi="Consolas"/>
-          <w:highlight w:val="lightGray"/>
-        </w:rPr>
-        <w:t>api.zsight.tech</w:t>
-      </w:r>
-      <w:proofErr w:type="spellEnd"/>
-      <w:r>
-        <w:rPr>
-          <w:rFonts w:ascii="Consolas" w:hAnsi="Consolas"/>
-          <w:highlight w:val="lightGray"/>
-        </w:rPr>
-        <w:t>/</w:t>
-      </w:r>
-      <w:proofErr w:type="spellStart"/>
-      <w:r>
-        <w:rPr>
-          <w:rFonts w:ascii="Consolas" w:hAnsi="Consolas"/>
-          <w:highlight w:val="lightGray"/>
-        </w:rPr>
-        <w:t>tago</w:t>
-      </w:r>
-      <w:proofErr w:type="spellEnd"/>
+        <w:t>Base pat</w:t>
+      </w:r>
+      <w:r>
+        <w:t xml:space="preserve">h </w:t>
+      </w:r>
+      <w:hyperlink r:id="rId17" w:anchor="/" w:history="1">
+        <w:r>
+          <w:rPr>
+            <w:rStyle w:val="Hyperlink"/>
+          </w:rPr>
+          <w:t>https://api.zsight.tech/docs/tago#/</w:t>
+        </w:r>
+      </w:hyperlink>
       <w:r>
         <w:t xml:space="preserve">, authenticated with </w:t>
       </w:r>
@@ -8241,8 +8597,21 @@
     <w:p>
       <w:pPr>
         <w:pStyle w:val="Heading1"/>
-      </w:pPr>
-      <w:bookmarkStart w:id="17" w:name="_Toc240789701"/>
+        <w:sectPr>
+          <w:headerReference w:type="default" r:id="rId18"/>
+          <w:pgSz w:w="12240" w:h="15840"/>
+          <w:pgMar w:top="1411" w:right="850" w:bottom="1411" w:left="850" w:header="576" w:footer="720" w:gutter="0"/>
+          <w:pgNumType w:chapSep="period"/>
+          <w:cols w:space="720"/>
+          <w:docGrid w:linePitch="360"/>
+        </w:sectPr>
+      </w:pPr>
+    </w:p>
+    <w:p>
+      <w:pPr>
+        <w:pStyle w:val="Heading1"/>
+      </w:pPr>
+      <w:bookmarkStart w:id="17" w:name="_Toc241003250"/>
       <w:r>
         <w:lastRenderedPageBreak/>
         <w:t>CONTAINER PROVISIONING</w:t>
@@ -8253,7 +8622,7 @@
       <w:pPr>
         <w:pStyle w:val="Heading2"/>
       </w:pPr>
-      <w:bookmarkStart w:id="18" w:name="_Toc240789702"/>
+      <w:bookmarkStart w:id="18" w:name="_Toc241003251"/>
       <w:r>
         <w:t>Entry point: the Hauler Quote</w:t>
       </w:r>
@@ -8865,7 +9234,7 @@
       <w:pPr>
         <w:pStyle w:val="Heading2"/>
       </w:pPr>
-      <w:bookmarkStart w:id="19" w:name="_Toc240789703"/>
+      <w:bookmarkStart w:id="19" w:name="_Toc241003252"/>
       <w:r>
         <w:t>Provisioning sequence</w:t>
       </w:r>
@@ -8891,10 +9260,10 @@
         </w:rPr>
         <w:lastRenderedPageBreak/>
         <w:drawing>
-          <wp:inline distT="0" distB="0" distL="0" distR="0" wp14:anchorId="2FEE8965" wp14:editId="5F2D2F9B">
-            <wp:extent cx="6692900" cy="2820670"/>
-            <wp:effectExtent l="0" t="0" r="0" b="0"/>
-            <wp:docPr id="1163726080" name="Picture 1"/>
+          <wp:inline distT="0" distB="0" distL="0" distR="0" wp14:anchorId="0B92493F" wp14:editId="7AE66810">
+            <wp:extent cx="6692900" cy="2851785"/>
+            <wp:effectExtent l="0" t="0" r="0" b="5715"/>
+            <wp:docPr id="1423403328" name="Picture 1"/>
             <wp:cNvGraphicFramePr>
               <a:graphicFrameLocks xmlns:a="http://schemas.openxmlformats.org/drawingml/2006/main" noChangeAspect="1"/>
             </wp:cNvGraphicFramePr>
@@ -8902,11 +9271,11 @@
               <a:graphicData uri="http://schemas.openxmlformats.org/drawingml/2006/picture">
                 <pic:pic xmlns:pic="http://schemas.openxmlformats.org/drawingml/2006/picture">
                   <pic:nvPicPr>
-                    <pic:cNvPr id="1163726080" name=""/>
+                    <pic:cNvPr id="1423403328" name=""/>
                     <pic:cNvPicPr/>
                   </pic:nvPicPr>
                   <pic:blipFill>
-                    <a:blip r:embed="rId14"/>
+                    <a:blip r:embed="rId19"/>
                     <a:stretch>
                       <a:fillRect/>
                     </a:stretch>
@@ -8914,7 +9283,7 @@
                   <pic:spPr>
                     <a:xfrm>
                       <a:off x="0" y="0"/>
-                      <a:ext cx="6692900" cy="2820670"/>
+                      <a:ext cx="6692900" cy="2851785"/>
                     </a:xfrm>
                     <a:prstGeom prst="rect">
                       <a:avLst/>
@@ -9029,7 +9398,7 @@
       <w:pPr>
         <w:pStyle w:val="Heading2"/>
       </w:pPr>
-      <w:bookmarkStart w:id="20" w:name="_Toc240789704"/>
+      <w:bookmarkStart w:id="20" w:name="_Toc241003253"/>
       <w:r>
         <w:t>Step-by-step reference</w:t>
       </w:r>
@@ -10370,8 +10739,21 @@
     <w:p>
       <w:pPr>
         <w:pStyle w:val="Heading1"/>
-      </w:pPr>
-      <w:bookmarkStart w:id="21" w:name="_Toc240789705"/>
+        <w:sectPr>
+          <w:headerReference w:type="default" r:id="rId20"/>
+          <w:pgSz w:w="12240" w:h="15840"/>
+          <w:pgMar w:top="1411" w:right="850" w:bottom="1411" w:left="850" w:header="576" w:footer="720" w:gutter="0"/>
+          <w:pgNumType w:chapSep="period"/>
+          <w:cols w:space="720"/>
+          <w:docGrid w:linePitch="360"/>
+        </w:sectPr>
+      </w:pPr>
+    </w:p>
+    <w:p>
+      <w:pPr>
+        <w:pStyle w:val="Heading1"/>
+      </w:pPr>
+      <w:bookmarkStart w:id="21" w:name="_Toc241003254"/>
       <w:r>
         <w:lastRenderedPageBreak/>
         <w:t>CONTAINER STATUS LIFECYCLE</w:t>
@@ -10389,10 +10771,10 @@
           <w:noProof/>
         </w:rPr>
         <w:drawing>
-          <wp:inline distT="0" distB="0" distL="0" distR="0" wp14:anchorId="0AB17B92" wp14:editId="7D9D89F4">
-            <wp:extent cx="6692900" cy="1710690"/>
+          <wp:inline distT="0" distB="0" distL="0" distR="0" wp14:anchorId="6C1EF9F8" wp14:editId="446825B4">
+            <wp:extent cx="6692900" cy="2263140"/>
             <wp:effectExtent l="0" t="0" r="0" b="3810"/>
-            <wp:docPr id="1721302821" name="Picture 1"/>
+            <wp:docPr id="655288101" name="Picture 1"/>
             <wp:cNvGraphicFramePr>
               <a:graphicFrameLocks xmlns:a="http://schemas.openxmlformats.org/drawingml/2006/main" noChangeAspect="1"/>
             </wp:cNvGraphicFramePr>
@@ -10400,11 +10782,11 @@
               <a:graphicData uri="http://schemas.openxmlformats.org/drawingml/2006/picture">
                 <pic:pic xmlns:pic="http://schemas.openxmlformats.org/drawingml/2006/picture">
                   <pic:nvPicPr>
-                    <pic:cNvPr id="1721302821" name=""/>
+                    <pic:cNvPr id="655288101" name=""/>
                     <pic:cNvPicPr/>
                   </pic:nvPicPr>
                   <pic:blipFill>
-                    <a:blip r:embed="rId15"/>
+                    <a:blip r:embed="rId21"/>
                     <a:stretch>
                       <a:fillRect/>
                     </a:stretch>
@@ -10412,7 +10794,7 @@
                   <pic:spPr>
                     <a:xfrm>
                       <a:off x="0" y="0"/>
-                      <a:ext cx="6692900" cy="1710690"/>
+                      <a:ext cx="6692900" cy="2263140"/>
                     </a:xfrm>
                     <a:prstGeom prst="rect">
                       <a:avLst/>
@@ -10442,8 +10824,21 @@
     <w:p>
       <w:pPr>
         <w:pStyle w:val="Heading1"/>
-      </w:pPr>
-      <w:bookmarkStart w:id="22" w:name="_Toc240789706"/>
+        <w:sectPr>
+          <w:headerReference w:type="default" r:id="rId22"/>
+          <w:pgSz w:w="12240" w:h="15840"/>
+          <w:pgMar w:top="1411" w:right="850" w:bottom="1411" w:left="850" w:header="576" w:footer="720" w:gutter="0"/>
+          <w:pgNumType w:chapSep="period"/>
+          <w:cols w:space="720"/>
+          <w:docGrid w:linePitch="360"/>
+        </w:sectPr>
+      </w:pPr>
+    </w:p>
+    <w:p>
+      <w:pPr>
+        <w:pStyle w:val="Heading1"/>
+      </w:pPr>
+      <w:bookmarkStart w:id="22" w:name="_Toc241003255"/>
       <w:r>
         <w:lastRenderedPageBreak/>
         <w:t>DEVICE REPLACEMENT ON AN EXISTING CONTAINER</w:t>
@@ -10990,14 +11385,11 @@
       </w:r>
     </w:p>
     <w:p/>
-    <w:p/>
-    <w:p/>
-    <w:p/>
-    <w:p/>
     <w:p>
       <w:pPr>
+        <w:pStyle w:val="Heading1"/>
         <w:sectPr>
-          <w:headerReference w:type="default" r:id="rId16"/>
+          <w:headerReference w:type="default" r:id="rId23"/>
           <w:pgSz w:w="12240" w:h="15840"/>
           <w:pgMar w:top="1411" w:right="850" w:bottom="1411" w:left="850" w:header="576" w:footer="720" w:gutter="0"/>
           <w:pgNumType w:chapSep="period"/>
@@ -11009,14 +11401,1595 @@
     <w:p>
       <w:pPr>
         <w:pStyle w:val="Heading1"/>
+      </w:pPr>
+      <w:bookmarkStart w:id="23" w:name="_Toc241003256"/>
+      <w:r>
+        <w:lastRenderedPageBreak/>
+        <w:t>ONGOING ENTITY UPDATES</w:t>
+      </w:r>
+      <w:bookmarkEnd w:id="23"/>
+    </w:p>
+    <w:p>
+      <w:r>
+        <w:t xml:space="preserve">After provisioning, QuickBase's only role is to notify ZSight when something changes. </w:t>
+      </w:r>
+      <w:proofErr w:type="spellStart"/>
+      <w:r>
+        <w:t>ZSight's</w:t>
+      </w:r>
+      <w:proofErr w:type="spellEnd"/>
+      <w:r>
+        <w:t xml:space="preserve"> job is then to decide whether Tago needs to know.</w:t>
+      </w:r>
+    </w:p>
+    <w:p>
+      <w:r>
+        <w:drawing>
+          <wp:inline distT="0" distB="0" distL="0" distR="0" wp14:anchorId="50FE58D7" wp14:editId="4FEDFCC4">
+            <wp:extent cx="6692900" cy="3232150"/>
+            <wp:effectExtent l="0" t="0" r="0" b="6350"/>
+            <wp:docPr id="903081100" name="Picture 1"/>
+            <wp:cNvGraphicFramePr>
+              <a:graphicFrameLocks xmlns:a="http://schemas.openxmlformats.org/drawingml/2006/main" noChangeAspect="1"/>
+            </wp:cNvGraphicFramePr>
+            <a:graphic xmlns:a="http://schemas.openxmlformats.org/drawingml/2006/main">
+              <a:graphicData uri="http://schemas.openxmlformats.org/drawingml/2006/picture">
+                <pic:pic xmlns:pic="http://schemas.openxmlformats.org/drawingml/2006/picture">
+                  <pic:nvPicPr>
+                    <pic:cNvPr id="903081100" name=""/>
+                    <pic:cNvPicPr/>
+                  </pic:nvPicPr>
+                  <pic:blipFill>
+                    <a:blip r:embed="rId24"/>
+                    <a:stretch>
+                      <a:fillRect/>
+                    </a:stretch>
+                  </pic:blipFill>
+                  <pic:spPr>
+                    <a:xfrm>
+                      <a:off x="0" y="0"/>
+                      <a:ext cx="6692900" cy="3232150"/>
+                    </a:xfrm>
+                    <a:prstGeom prst="rect">
+                      <a:avLst/>
+                    </a:prstGeom>
+                  </pic:spPr>
+                </pic:pic>
+              </a:graphicData>
+            </a:graphic>
+          </wp:inline>
+        </w:drawing>
+      </w:r>
+    </w:p>
+    <w:p>
+      <w:r>
+        <w:t xml:space="preserve">Four entities follow this path: Customer, Vendor, Site and Product. The generic </w:t>
+      </w:r>
+      <w:r>
+        <w:rPr>
+          <w:rFonts w:ascii="Consolas" w:hAnsi="Consolas"/>
+          <w:highlight w:val="lightGray"/>
+        </w:rPr>
+        <w:t>/v1</w:t>
+      </w:r>
+      <w:r>
+        <w:t xml:space="preserve"> endpoints identify the ZSight record by its </w:t>
+      </w:r>
+      <w:proofErr w:type="spellStart"/>
+      <w:r>
+        <w:rPr>
+          <w:rFonts w:ascii="Consolas" w:hAnsi="Consolas"/>
+          <w:highlight w:val="lightGray"/>
+        </w:rPr>
+        <w:t>external_id</w:t>
+      </w:r>
+      <w:proofErr w:type="spellEnd"/>
+      <w:r>
+        <w:t xml:space="preserve">, which is the QuickBase record ID captured at provisioning, so the update lands on the right row without QuickBase needing to know </w:t>
+      </w:r>
+      <w:proofErr w:type="spellStart"/>
+      <w:r>
+        <w:t>ZSight's</w:t>
+      </w:r>
+      <w:proofErr w:type="spellEnd"/>
+      <w:r>
+        <w:t xml:space="preserve"> internal identifiers.</w:t>
+      </w:r>
+    </w:p>
+    <w:p/>
+    <w:p>
+      <w:pPr>
+        <w:pStyle w:val="Heading2"/>
+      </w:pPr>
+      <w:bookmarkStart w:id="24" w:name="_Toc241003257"/>
+      <w:r>
+        <w:t>The 60-second audit-trail guard</w:t>
+      </w:r>
+      <w:bookmarkEnd w:id="24"/>
+    </w:p>
+    <w:p>
+      <w:r>
+        <w:t xml:space="preserve">ZSight writes an audit trail entry every time QuickBase updates data. Before sending a service update to Tago, the extension confirms two things: that the container belongs to </w:t>
+      </w:r>
+      <w:proofErr w:type="spellStart"/>
+      <w:r>
+        <w:t>ZTERS</w:t>
+      </w:r>
+      <w:proofErr w:type="spellEnd"/>
+      <w:r>
+        <w:t xml:space="preserve">, and that the audit trail shows the edit was made by the </w:t>
+      </w:r>
+      <w:proofErr w:type="spellStart"/>
+      <w:r>
+        <w:t>ZTERS</w:t>
+      </w:r>
+      <w:proofErr w:type="spellEnd"/>
+      <w:r>
+        <w:t xml:space="preserve"> integration account within the last 60 seconds. The account is held on an allow list.</w:t>
+      </w:r>
+    </w:p>
+    <w:p>
+      <w:r>
+        <w:t>The effect is that only changes which genuinely originated in QuickBase are propagated onward to Tago. An edit made by a person inside ZSight updates the ZSight record but stops there.</w:t>
+      </w:r>
+    </w:p>
+    <w:tbl>
+      <w:tblPr>
+        <w:tblStyle w:val="TableGrid"/>
+        <w:tblW w:w="10615" w:type="dxa"/>
+        <w:tblBorders>
+          <w:top w:val="single" w:sz="4" w:space="0" w:color="D1D1D1" w:themeColor="background2" w:themeShade="E6"/>
+          <w:left w:val="single" w:sz="4" w:space="0" w:color="D1D1D1" w:themeColor="background2" w:themeShade="E6"/>
+          <w:bottom w:val="single" w:sz="4" w:space="0" w:color="D1D1D1" w:themeColor="background2" w:themeShade="E6"/>
+          <w:right w:val="single" w:sz="4" w:space="0" w:color="D1D1D1" w:themeColor="background2" w:themeShade="E6"/>
+          <w:insideH w:val="single" w:sz="4" w:space="0" w:color="D1D1D1" w:themeColor="background2" w:themeShade="E6"/>
+          <w:insideV w:val="single" w:sz="4" w:space="0" w:color="D1D1D1" w:themeColor="background2" w:themeShade="E6"/>
+        </w:tblBorders>
+        <w:tblLook w:val="04A0" w:firstRow="1" w:lastRow="0" w:firstColumn="1" w:lastColumn="0" w:noHBand="0" w:noVBand="1"/>
+      </w:tblPr>
+      <w:tblGrid>
+        <w:gridCol w:w="1975"/>
+        <w:gridCol w:w="2070"/>
+        <w:gridCol w:w="6570"/>
+      </w:tblGrid>
+      <w:tr>
+        <w:tc>
+          <w:tcPr>
+            <w:tcW w:w="1975" w:type="dxa"/>
+            <w:shd w:val="clear" w:color="auto" w:fill="4F7ABA"/>
+          </w:tcPr>
+          <w:p>
+            <w:pPr>
+              <w:rPr>
+                <w:b/>
+                <w:bCs/>
+                <w:color w:val="FFFFFF" w:themeColor="background1"/>
+                <w:sz w:val="20"/>
+                <w:szCs w:val="20"/>
+              </w:rPr>
+            </w:pPr>
+            <w:r>
+              <w:rPr>
+                <w:b/>
+                <w:bCs/>
+                <w:color w:val="FFFFFF" w:themeColor="background1"/>
+                <w:sz w:val="20"/>
+                <w:szCs w:val="20"/>
+              </w:rPr>
+              <w:t>Change</w:t>
+            </w:r>
+          </w:p>
+        </w:tc>
+        <w:tc>
+          <w:tcPr>
+            <w:tcW w:w="2070" w:type="dxa"/>
+            <w:shd w:val="clear" w:color="auto" w:fill="4F7ABA"/>
+          </w:tcPr>
+          <w:p>
+            <w:pPr>
+              <w:rPr>
+                <w:b/>
+                <w:bCs/>
+                <w:color w:val="FFFFFF" w:themeColor="background1"/>
+                <w:sz w:val="20"/>
+                <w:szCs w:val="20"/>
+              </w:rPr>
+            </w:pPr>
+            <w:r>
+              <w:rPr>
+                <w:b/>
+                <w:bCs/>
+                <w:color w:val="FFFFFF" w:themeColor="background1"/>
+                <w:sz w:val="20"/>
+                <w:szCs w:val="20"/>
+              </w:rPr>
+              <w:t>Originating entity</w:t>
+            </w:r>
+          </w:p>
+        </w:tc>
+        <w:tc>
+          <w:tcPr>
+            <w:tcW w:w="6570" w:type="dxa"/>
+            <w:shd w:val="clear" w:color="auto" w:fill="4F7ABA"/>
+          </w:tcPr>
+          <w:p>
+            <w:pPr>
+              <w:rPr>
+                <w:b/>
+                <w:bCs/>
+                <w:color w:val="FFFFFF" w:themeColor="background1"/>
+                <w:sz w:val="20"/>
+                <w:szCs w:val="20"/>
+              </w:rPr>
+            </w:pPr>
+            <w:r>
+              <w:rPr>
+                <w:b/>
+                <w:bCs/>
+                <w:color w:val="FFFFFF" w:themeColor="background1"/>
+                <w:sz w:val="20"/>
+                <w:szCs w:val="20"/>
+              </w:rPr>
+              <w:t>Why Tago needs it</w:t>
+            </w:r>
+          </w:p>
+        </w:tc>
+      </w:tr>
+      <w:tr>
+        <w:trPr>
+          <w:trHeight w:val="244"/>
+        </w:trPr>
+        <w:tc>
+          <w:tcPr>
+            <w:tcW w:w="1975" w:type="dxa"/>
+          </w:tcPr>
+          <w:p>
+            <w:pPr>
+              <w:rPr>
+                <w:rFonts w:cs="Arial"/>
+                <w:sz w:val="20"/>
+                <w:szCs w:val="20"/>
+              </w:rPr>
+            </w:pPr>
+            <w:r>
+              <w:rPr>
+                <w:sz w:val="20"/>
+                <w:szCs w:val="20"/>
+              </w:rPr>
+              <w:t>Pickup schedule</w:t>
+            </w:r>
+          </w:p>
+        </w:tc>
+        <w:tc>
+          <w:tcPr>
+            <w:tcW w:w="2070" w:type="dxa"/>
+          </w:tcPr>
+          <w:p>
+            <w:pPr>
+              <w:rPr>
+                <w:rFonts w:cs="Arial"/>
+                <w:sz w:val="20"/>
+                <w:szCs w:val="20"/>
+              </w:rPr>
+            </w:pPr>
+            <w:r>
+              <w:rPr>
+                <w:sz w:val="20"/>
+                <w:szCs w:val="20"/>
+              </w:rPr>
+              <w:t>Product</w:t>
+            </w:r>
+          </w:p>
+        </w:tc>
+        <w:tc>
+          <w:tcPr>
+            <w:tcW w:w="6570" w:type="dxa"/>
+          </w:tcPr>
+          <w:p>
+            <w:pPr>
+              <w:rPr>
+                <w:rFonts w:cs="Arial"/>
+                <w:sz w:val="20"/>
+                <w:szCs w:val="20"/>
+              </w:rPr>
+            </w:pPr>
+            <w:r>
+              <w:rPr>
+                <w:sz w:val="20"/>
+                <w:szCs w:val="20"/>
+              </w:rPr>
+              <w:t>Determines when collection is expected, used in Tago's reporting</w:t>
+            </w:r>
+          </w:p>
+        </w:tc>
+      </w:tr>
+      <w:tr>
+        <w:trPr>
+          <w:trHeight w:val="253"/>
+        </w:trPr>
+        <w:tc>
+          <w:tcPr>
+            <w:tcW w:w="1975" w:type="dxa"/>
+          </w:tcPr>
+          <w:p>
+            <w:pPr>
+              <w:rPr>
+                <w:rFonts w:cs="Arial"/>
+                <w:sz w:val="20"/>
+                <w:szCs w:val="20"/>
+              </w:rPr>
+            </w:pPr>
+            <w:r>
+              <w:rPr>
+                <w:sz w:val="20"/>
+                <w:szCs w:val="20"/>
+              </w:rPr>
+              <w:t>Address</w:t>
+            </w:r>
+          </w:p>
+        </w:tc>
+        <w:tc>
+          <w:tcPr>
+            <w:tcW w:w="2070" w:type="dxa"/>
+          </w:tcPr>
+          <w:p>
+            <w:pPr>
+              <w:rPr>
+                <w:rFonts w:cs="Arial"/>
+                <w:sz w:val="20"/>
+                <w:szCs w:val="20"/>
+              </w:rPr>
+            </w:pPr>
+            <w:r>
+              <w:rPr>
+                <w:sz w:val="20"/>
+                <w:szCs w:val="20"/>
+              </w:rPr>
+              <w:t>Site</w:t>
+            </w:r>
+          </w:p>
+        </w:tc>
+        <w:tc>
+          <w:tcPr>
+            <w:tcW w:w="6570" w:type="dxa"/>
+          </w:tcPr>
+          <w:p>
+            <w:pPr>
+              <w:rPr>
+                <w:rFonts w:cs="Arial"/>
+                <w:sz w:val="20"/>
+                <w:szCs w:val="20"/>
+              </w:rPr>
+            </w:pPr>
+            <w:r>
+              <w:rPr>
+                <w:sz w:val="20"/>
+                <w:szCs w:val="20"/>
+              </w:rPr>
+              <w:t>Location of the registered asset</w:t>
+            </w:r>
+          </w:p>
+        </w:tc>
+      </w:tr>
+      <w:tr>
+        <w:tc>
+          <w:tcPr>
+            <w:tcW w:w="1975" w:type="dxa"/>
+          </w:tcPr>
+          <w:p>
+            <w:pPr>
+              <w:rPr>
+                <w:rFonts w:cs="Arial"/>
+                <w:sz w:val="20"/>
+                <w:szCs w:val="20"/>
+              </w:rPr>
+            </w:pPr>
+            <w:r>
+              <w:rPr>
+                <w:sz w:val="20"/>
+                <w:szCs w:val="20"/>
+              </w:rPr>
+              <w:t>Asset</w:t>
+            </w:r>
+          </w:p>
+        </w:tc>
+        <w:tc>
+          <w:tcPr>
+            <w:tcW w:w="2070" w:type="dxa"/>
+          </w:tcPr>
+          <w:p>
+            <w:pPr>
+              <w:rPr>
+                <w:rFonts w:cs="Arial"/>
+                <w:sz w:val="20"/>
+                <w:szCs w:val="20"/>
+              </w:rPr>
+            </w:pPr>
+            <w:r>
+              <w:rPr>
+                <w:sz w:val="20"/>
+                <w:szCs w:val="20"/>
+              </w:rPr>
+              <w:t>Container</w:t>
+            </w:r>
+          </w:p>
+        </w:tc>
+        <w:tc>
+          <w:tcPr>
+            <w:tcW w:w="6570" w:type="dxa"/>
+          </w:tcPr>
+          <w:p>
+            <w:pPr>
+              <w:rPr>
+                <w:rFonts w:cs="Arial"/>
+                <w:sz w:val="20"/>
+                <w:szCs w:val="20"/>
+              </w:rPr>
+            </w:pPr>
+            <w:r>
+              <w:rPr>
+                <w:sz w:val="20"/>
+                <w:szCs w:val="20"/>
+              </w:rPr>
+              <w:t>Identity and naming of the registered asset</w:t>
+            </w:r>
+          </w:p>
+        </w:tc>
+      </w:tr>
+      <w:tr>
+        <w:tc>
+          <w:tcPr>
+            <w:tcW w:w="1975" w:type="dxa"/>
+          </w:tcPr>
+          <w:p>
+            <w:pPr>
+              <w:rPr>
+                <w:rFonts w:cs="Arial"/>
+                <w:sz w:val="20"/>
+                <w:szCs w:val="20"/>
+              </w:rPr>
+            </w:pPr>
+            <w:r>
+              <w:rPr>
+                <w:sz w:val="20"/>
+                <w:szCs w:val="20"/>
+              </w:rPr>
+              <w:t>Variant</w:t>
+            </w:r>
+          </w:p>
+        </w:tc>
+        <w:tc>
+          <w:tcPr>
+            <w:tcW w:w="2070" w:type="dxa"/>
+          </w:tcPr>
+          <w:p>
+            <w:pPr>
+              <w:rPr>
+                <w:rFonts w:cs="Arial"/>
+                <w:sz w:val="20"/>
+                <w:szCs w:val="20"/>
+              </w:rPr>
+            </w:pPr>
+            <w:r>
+              <w:rPr>
+                <w:sz w:val="20"/>
+                <w:szCs w:val="20"/>
+              </w:rPr>
+              <w:t>Product</w:t>
+            </w:r>
+          </w:p>
+        </w:tc>
+        <w:tc>
+          <w:tcPr>
+            <w:tcW w:w="6570" w:type="dxa"/>
+          </w:tcPr>
+          <w:p>
+            <w:pPr>
+              <w:rPr>
+                <w:rFonts w:cs="Arial"/>
+                <w:sz w:val="20"/>
+                <w:szCs w:val="20"/>
+              </w:rPr>
+            </w:pPr>
+            <w:r>
+              <w:rPr>
+                <w:sz w:val="20"/>
+                <w:szCs w:val="20"/>
+              </w:rPr>
+              <w:t>Size and content type of the container</w:t>
+            </w:r>
+          </w:p>
+        </w:tc>
+      </w:tr>
+    </w:tbl>
+    <w:p/>
+    <w:p/>
+    <w:p/>
+    <w:p>
+      <w:pPr>
+        <w:pStyle w:val="Heading1"/>
+        <w:sectPr>
+          <w:headerReference w:type="default" r:id="rId25"/>
+          <w:pgSz w:w="12240" w:h="15840"/>
+          <w:pgMar w:top="1411" w:right="850" w:bottom="1411" w:left="850" w:header="576" w:footer="720" w:gutter="0"/>
+          <w:pgNumType w:chapSep="period"/>
+          <w:cols w:space="720"/>
+          <w:docGrid w:linePitch="360"/>
+        </w:sectPr>
+      </w:pPr>
+    </w:p>
+    <w:p>
+      <w:pPr>
+        <w:pStyle w:val="Heading1"/>
+      </w:pPr>
+      <w:bookmarkStart w:id="25" w:name="_Toc241003258"/>
+      <w:r>
+        <w:lastRenderedPageBreak/>
+        <w:t>OUTBOUND WRITE TO QUICKBASE</w:t>
+      </w:r>
+      <w:bookmarkEnd w:id="25"/>
+    </w:p>
+    <w:p>
+      <w:r>
+        <w:t>One message, two fields, once per installation. This is the entire write surface in that direction.</w:t>
+      </w:r>
+    </w:p>
+    <w:p>
+      <w:r>
+        <w:t xml:space="preserve">When the installation arrives from Tago and the container moves to Active, ZSight writes two fields onto the corresponding Hauler Quote: </w:t>
+      </w:r>
+      <w:proofErr w:type="spellStart"/>
+      <w:r>
+        <w:rPr>
+          <w:rFonts w:ascii="Consolas" w:hAnsi="Consolas"/>
+          <w:highlight w:val="lightGray"/>
+        </w:rPr>
+        <w:t>zsight_install_completed</w:t>
+      </w:r>
+      <w:proofErr w:type="spellEnd"/>
+      <w:r>
+        <w:t xml:space="preserve">, a completion flag, and </w:t>
+      </w:r>
+      <w:proofErr w:type="spellStart"/>
+      <w:r>
+        <w:rPr>
+          <w:rFonts w:ascii="Consolas" w:hAnsi="Consolas"/>
+          <w:highlight w:val="lightGray"/>
+        </w:rPr>
+        <w:t>zsight_actual_install_date</w:t>
+      </w:r>
+      <w:proofErr w:type="spellEnd"/>
+      <w:r>
+        <w:t>, the actual installation date. QuickBase holds a projected install date of its own, which ZSight does not touch.</w:t>
+      </w:r>
+    </w:p>
+    <w:tbl>
+      <w:tblPr>
+        <w:tblStyle w:val="TableGrid"/>
+        <w:tblW w:w="10612" w:type="dxa"/>
+        <w:tblBorders>
+          <w:top w:val="single" w:sz="6" w:space="0" w:color="C00000"/>
+          <w:left w:val="single" w:sz="6" w:space="0" w:color="C00000"/>
+          <w:bottom w:val="single" w:sz="6" w:space="0" w:color="C00000"/>
+          <w:right w:val="single" w:sz="6" w:space="0" w:color="C00000"/>
+          <w:insideH w:val="single" w:sz="6" w:space="0" w:color="C00000"/>
+          <w:insideV w:val="single" w:sz="6" w:space="0" w:color="C00000"/>
+        </w:tblBorders>
+        <w:shd w:val="clear" w:color="auto" w:fill="FAE2D5" w:themeFill="accent2" w:themeFillTint="33"/>
+        <w:tblLook w:val="04A0" w:firstRow="1" w:lastRow="0" w:firstColumn="1" w:lastColumn="0" w:noHBand="0" w:noVBand="1"/>
+      </w:tblPr>
+      <w:tblGrid>
+        <w:gridCol w:w="10612"/>
+      </w:tblGrid>
+      <w:tr>
+        <w:trPr>
+          <w:trHeight w:val="568"/>
+        </w:trPr>
+        <w:tc>
+          <w:tcPr>
+            <w:tcW w:w="10612" w:type="dxa"/>
+            <w:tcBorders>
+              <w:top w:val="single" w:sz="4" w:space="0" w:color="E29898"/>
+              <w:left w:val="single" w:sz="4" w:space="0" w:color="E29898"/>
+              <w:bottom w:val="single" w:sz="4" w:space="0" w:color="E29898"/>
+              <w:right w:val="single" w:sz="4" w:space="0" w:color="E29898"/>
+            </w:tcBorders>
+            <w:shd w:val="clear" w:color="auto" w:fill="FFE7E7"/>
+          </w:tcPr>
+          <w:p>
+            <w:r>
+              <w:rPr>
+                <w:b/>
+                <w:bCs/>
+                <w:sz w:val="20"/>
+                <w:szCs w:val="20"/>
+              </w:rPr>
+              <w:t>Warning:</w:t>
+            </w:r>
+            <w:r>
+              <w:rPr>
+                <w:sz w:val="20"/>
+                <w:szCs w:val="20"/>
+              </w:rPr>
+              <w:t xml:space="preserve"> </w:t>
+            </w:r>
+            <w:r>
+              <w:rPr>
+                <w:sz w:val="20"/>
+                <w:szCs w:val="20"/>
+              </w:rPr>
+              <w:t>Only installation is written to QuickBase. When a container or device is removed, nothing equivalent is sent. This part of the process is acknowledged as currently disconnected while the platform is in transition</w:t>
+            </w:r>
+            <w:r>
+              <w:rPr>
+                <w:sz w:val="20"/>
+                <w:szCs w:val="20"/>
+              </w:rPr>
+              <w:t>.</w:t>
+            </w:r>
+          </w:p>
+        </w:tc>
+      </w:tr>
+    </w:tbl>
+    <w:p/>
+    <w:p/>
+    <w:p>
+      <w:pPr>
+        <w:pStyle w:val="Heading2"/>
+      </w:pPr>
+      <w:bookmarkStart w:id="26" w:name="_Toc241003259"/>
+      <w:r>
+        <w:t>Internal events</w:t>
+      </w:r>
+      <w:bookmarkEnd w:id="26"/>
+    </w:p>
+    <w:p>
+      <w:r>
+        <w:t xml:space="preserve">Three listeners in the </w:t>
+      </w:r>
+      <w:proofErr w:type="spellStart"/>
+      <w:r>
+        <w:t>ZTERS</w:t>
+      </w:r>
+      <w:proofErr w:type="spellEnd"/>
+      <w:r>
+        <w:t xml:space="preserve"> extension carry the flows described above. They are listed here under the names used in the code.</w:t>
+      </w:r>
+    </w:p>
+    <w:tbl>
+      <w:tblPr>
+        <w:tblStyle w:val="TableGrid"/>
+        <w:tblW w:w="0" w:type="auto"/>
+        <w:tblBorders>
+          <w:top w:val="single" w:sz="4" w:space="0" w:color="D1D1D1" w:themeColor="background2" w:themeShade="E6"/>
+          <w:left w:val="single" w:sz="4" w:space="0" w:color="D1D1D1" w:themeColor="background2" w:themeShade="E6"/>
+          <w:bottom w:val="single" w:sz="4" w:space="0" w:color="D1D1D1" w:themeColor="background2" w:themeShade="E6"/>
+          <w:right w:val="single" w:sz="4" w:space="0" w:color="D1D1D1" w:themeColor="background2" w:themeShade="E6"/>
+          <w:insideH w:val="single" w:sz="4" w:space="0" w:color="D1D1D1" w:themeColor="background2" w:themeShade="E6"/>
+          <w:insideV w:val="single" w:sz="4" w:space="0" w:color="D1D1D1" w:themeColor="background2" w:themeShade="E6"/>
+        </w:tblBorders>
+        <w:tblLook w:val="04A0" w:firstRow="1" w:lastRow="0" w:firstColumn="1" w:lastColumn="0" w:noHBand="0" w:noVBand="1"/>
+      </w:tblPr>
+      <w:tblGrid>
+        <w:gridCol w:w="1673"/>
+        <w:gridCol w:w="2764"/>
+        <w:gridCol w:w="3134"/>
+        <w:gridCol w:w="2959"/>
+      </w:tblGrid>
+      <w:tr>
+        <w:tc>
+          <w:tcPr>
+            <w:tcW w:w="761" w:type="dxa"/>
+            <w:shd w:val="clear" w:color="auto" w:fill="4F7ABA"/>
+          </w:tcPr>
+          <w:p>
+            <w:pPr>
+              <w:rPr>
+                <w:b/>
+                <w:bCs/>
+                <w:color w:val="FFFFFF" w:themeColor="background1"/>
+                <w:sz w:val="20"/>
+                <w:szCs w:val="20"/>
+              </w:rPr>
+            </w:pPr>
+            <w:r>
+              <w:rPr>
+                <w:b/>
+                <w:bCs/>
+                <w:color w:val="FFFFFF" w:themeColor="background1"/>
+                <w:sz w:val="20"/>
+                <w:szCs w:val="20"/>
+              </w:rPr>
+              <w:t>Event</w:t>
+            </w:r>
+          </w:p>
+        </w:tc>
+        <w:tc>
+          <w:tcPr>
+            <w:tcW w:w="3046" w:type="dxa"/>
+            <w:shd w:val="clear" w:color="auto" w:fill="4F7ABA"/>
+          </w:tcPr>
+          <w:p>
+            <w:pPr>
+              <w:rPr>
+                <w:b/>
+                <w:bCs/>
+                <w:color w:val="FFFFFF" w:themeColor="background1"/>
+                <w:sz w:val="20"/>
+                <w:szCs w:val="20"/>
+              </w:rPr>
+            </w:pPr>
+            <w:r>
+              <w:rPr>
+                <w:b/>
+                <w:bCs/>
+                <w:color w:val="FFFFFF" w:themeColor="background1"/>
+                <w:sz w:val="20"/>
+                <w:szCs w:val="20"/>
+              </w:rPr>
+              <w:t>Fires when</w:t>
+            </w:r>
+          </w:p>
+        </w:tc>
+        <w:tc>
+          <w:tcPr>
+            <w:tcW w:w="3495" w:type="dxa"/>
+            <w:shd w:val="clear" w:color="auto" w:fill="4F7ABA"/>
+          </w:tcPr>
+          <w:p>
+            <w:pPr>
+              <w:rPr>
+                <w:b/>
+                <w:bCs/>
+                <w:color w:val="FFFFFF" w:themeColor="background1"/>
+                <w:sz w:val="20"/>
+                <w:szCs w:val="20"/>
+              </w:rPr>
+            </w:pPr>
+            <w:r>
+              <w:rPr>
+                <w:b/>
+                <w:bCs/>
+                <w:color w:val="FFFFFF" w:themeColor="background1"/>
+                <w:sz w:val="20"/>
+                <w:szCs w:val="20"/>
+              </w:rPr>
+              <w:t>Condition</w:t>
+            </w:r>
+          </w:p>
+        </w:tc>
+        <w:tc>
+          <w:tcPr>
+            <w:tcW w:w="3228" w:type="dxa"/>
+            <w:shd w:val="clear" w:color="auto" w:fill="4F7ABA"/>
+          </w:tcPr>
+          <w:p>
+            <w:pPr>
+              <w:rPr>
+                <w:b/>
+                <w:bCs/>
+                <w:color w:val="FFFFFF" w:themeColor="background1"/>
+                <w:sz w:val="20"/>
+                <w:szCs w:val="20"/>
+              </w:rPr>
+            </w:pPr>
+            <w:r>
+              <w:rPr>
+                <w:b/>
+                <w:bCs/>
+                <w:color w:val="FFFFFF" w:themeColor="background1"/>
+                <w:sz w:val="20"/>
+                <w:szCs w:val="20"/>
+              </w:rPr>
+              <w:t>Action</w:t>
+            </w:r>
+          </w:p>
+        </w:tc>
+      </w:tr>
+      <w:tr>
+        <w:trPr>
+          <w:trHeight w:val="226"/>
+        </w:trPr>
+        <w:tc>
+          <w:tcPr>
+            <w:tcW w:w="761" w:type="dxa"/>
+          </w:tcPr>
+          <w:p>
+            <w:pPr>
+              <w:rPr>
+                <w:rFonts w:cs="Arial"/>
+                <w:sz w:val="20"/>
+                <w:szCs w:val="20"/>
+              </w:rPr>
+            </w:pPr>
+            <w:proofErr w:type="spellStart"/>
+            <w:r>
+              <w:rPr>
+                <w:sz w:val="20"/>
+                <w:szCs w:val="20"/>
+              </w:rPr>
+              <w:t>AssetImport</w:t>
+            </w:r>
+            <w:proofErr w:type="spellEnd"/>
+          </w:p>
+        </w:tc>
+        <w:tc>
+          <w:tcPr>
+            <w:tcW w:w="3046" w:type="dxa"/>
+          </w:tcPr>
+          <w:p>
+            <w:pPr>
+              <w:rPr>
+                <w:rFonts w:ascii="Consolas" w:hAnsi="Consolas" w:cs="Arial"/>
+                <w:sz w:val="20"/>
+                <w:szCs w:val="20"/>
+              </w:rPr>
+            </w:pPr>
+            <w:r>
+              <w:rPr>
+                <w:sz w:val="20"/>
+                <w:szCs w:val="20"/>
+              </w:rPr>
+              <w:t>A Hauler Quote is imported or updated</w:t>
+            </w:r>
+          </w:p>
+        </w:tc>
+        <w:tc>
+          <w:tcPr>
+            <w:tcW w:w="3495" w:type="dxa"/>
+          </w:tcPr>
+          <w:p>
+            <w:pPr>
+              <w:rPr>
+                <w:rFonts w:ascii="Consolas" w:hAnsi="Consolas" w:cs="Arial"/>
+                <w:sz w:val="20"/>
+                <w:szCs w:val="20"/>
+              </w:rPr>
+            </w:pPr>
+            <w:r>
+              <w:rPr>
+                <w:sz w:val="20"/>
+                <w:szCs w:val="20"/>
+              </w:rPr>
+              <w:t>Is the asset already registered with Tago?</w:t>
+            </w:r>
+          </w:p>
+        </w:tc>
+        <w:tc>
+          <w:tcPr>
+            <w:tcW w:w="3228" w:type="dxa"/>
+          </w:tcPr>
+          <w:p>
+            <w:pPr>
+              <w:rPr>
+                <w:rFonts w:cs="Arial"/>
+                <w:sz w:val="20"/>
+                <w:szCs w:val="20"/>
+              </w:rPr>
+            </w:pPr>
+            <w:r>
+              <w:rPr>
+                <w:sz w:val="20"/>
+                <w:szCs w:val="20"/>
+              </w:rPr>
+              <w:t>Not registered → Asset Registration. Already registered → Service Update. Tago acknowledges either way.</w:t>
+            </w:r>
+          </w:p>
+        </w:tc>
+      </w:tr>
+      <w:tr>
+        <w:trPr>
+          <w:trHeight w:val="253"/>
+        </w:trPr>
+        <w:tc>
+          <w:tcPr>
+            <w:tcW w:w="761" w:type="dxa"/>
+          </w:tcPr>
+          <w:p>
+            <w:pPr>
+              <w:jc w:val="center"/>
+              <w:rPr>
+                <w:rFonts w:cs="Arial"/>
+                <w:sz w:val="20"/>
+                <w:szCs w:val="20"/>
+              </w:rPr>
+            </w:pPr>
+            <w:proofErr w:type="spellStart"/>
+            <w:r>
+              <w:rPr>
+                <w:sz w:val="20"/>
+                <w:szCs w:val="20"/>
+              </w:rPr>
+              <w:t>AssetInstallation</w:t>
+            </w:r>
+            <w:proofErr w:type="spellEnd"/>
+          </w:p>
+        </w:tc>
+        <w:tc>
+          <w:tcPr>
+            <w:tcW w:w="3046" w:type="dxa"/>
+          </w:tcPr>
+          <w:p>
+            <w:pPr>
+              <w:rPr>
+                <w:rFonts w:ascii="Consolas" w:hAnsi="Consolas" w:cs="Arial"/>
+                <w:sz w:val="20"/>
+                <w:szCs w:val="20"/>
+              </w:rPr>
+            </w:pPr>
+            <w:r>
+              <w:rPr>
+                <w:sz w:val="20"/>
+                <w:szCs w:val="20"/>
+              </w:rPr>
+              <w:t>Tago reports an installation, having been notified by the mobile app</w:t>
+            </w:r>
+          </w:p>
+        </w:tc>
+        <w:tc>
+          <w:tcPr>
+            <w:tcW w:w="3495" w:type="dxa"/>
+          </w:tcPr>
+          <w:p>
+            <w:pPr>
+              <w:rPr>
+                <w:rFonts w:ascii="Consolas" w:hAnsi="Consolas" w:cs="Arial"/>
+                <w:sz w:val="20"/>
+                <w:szCs w:val="20"/>
+              </w:rPr>
+            </w:pPr>
+            <w:r>
+              <w:rPr>
+                <w:sz w:val="20"/>
+                <w:szCs w:val="20"/>
+              </w:rPr>
+              <w:t xml:space="preserve">The container belongs to the </w:t>
+            </w:r>
+            <w:proofErr w:type="spellStart"/>
+            <w:r>
+              <w:rPr>
+                <w:sz w:val="20"/>
+                <w:szCs w:val="20"/>
+              </w:rPr>
+              <w:t>ZTERS</w:t>
+            </w:r>
+            <w:proofErr w:type="spellEnd"/>
+            <w:r>
+              <w:rPr>
+                <w:sz w:val="20"/>
+                <w:szCs w:val="20"/>
+              </w:rPr>
+              <w:t xml:space="preserve"> account</w:t>
+            </w:r>
+          </w:p>
+        </w:tc>
+        <w:tc>
+          <w:tcPr>
+            <w:tcW w:w="3228" w:type="dxa"/>
+          </w:tcPr>
+          <w:p>
+            <w:pPr>
+              <w:rPr>
+                <w:rFonts w:cs="Arial"/>
+                <w:sz w:val="20"/>
+                <w:szCs w:val="20"/>
+              </w:rPr>
+            </w:pPr>
+            <w:r>
+              <w:rPr>
+                <w:sz w:val="20"/>
+                <w:szCs w:val="20"/>
+              </w:rPr>
+              <w:t xml:space="preserve">Writes the two installation fields to QuickBase </w:t>
+            </w:r>
+          </w:p>
+        </w:tc>
+      </w:tr>
+      <w:tr>
+        <w:trPr>
+          <w:trHeight w:val="253"/>
+        </w:trPr>
+        <w:tc>
+          <w:tcPr>
+            <w:tcW w:w="761" w:type="dxa"/>
+          </w:tcPr>
+          <w:p>
+            <w:pPr>
+              <w:jc w:val="center"/>
+              <w:rPr>
+                <w:rFonts w:cs="Arial"/>
+                <w:sz w:val="20"/>
+                <w:szCs w:val="20"/>
+              </w:rPr>
+            </w:pPr>
+            <w:proofErr w:type="spellStart"/>
+            <w:r>
+              <w:rPr>
+                <w:sz w:val="20"/>
+                <w:szCs w:val="20"/>
+              </w:rPr>
+              <w:t>ProductUpdated</w:t>
+            </w:r>
+            <w:proofErr w:type="spellEnd"/>
+          </w:p>
+        </w:tc>
+        <w:tc>
+          <w:tcPr>
+            <w:tcW w:w="3046" w:type="dxa"/>
+          </w:tcPr>
+          <w:p>
+            <w:pPr>
+              <w:rPr>
+                <w:rFonts w:ascii="Consolas" w:hAnsi="Consolas" w:cs="Arial"/>
+                <w:sz w:val="20"/>
+                <w:szCs w:val="20"/>
+              </w:rPr>
+            </w:pPr>
+            <w:r>
+              <w:rPr>
+                <w:sz w:val="20"/>
+                <w:szCs w:val="20"/>
+              </w:rPr>
+              <w:t>A customer, vendor, site or product is updated</w:t>
+            </w:r>
+          </w:p>
+        </w:tc>
+        <w:tc>
+          <w:tcPr>
+            <w:tcW w:w="3495" w:type="dxa"/>
+          </w:tcPr>
+          <w:p>
+            <w:pPr>
+              <w:rPr>
+                <w:rFonts w:ascii="Consolas" w:hAnsi="Consolas" w:cs="Arial"/>
+                <w:sz w:val="20"/>
+                <w:szCs w:val="20"/>
+              </w:rPr>
+            </w:pPr>
+            <w:proofErr w:type="spellStart"/>
+            <w:r>
+              <w:rPr>
+                <w:sz w:val="20"/>
+                <w:szCs w:val="20"/>
+              </w:rPr>
+              <w:t>ZTERS</w:t>
+            </w:r>
+            <w:proofErr w:type="spellEnd"/>
+            <w:r>
+              <w:rPr>
+                <w:sz w:val="20"/>
+                <w:szCs w:val="20"/>
+              </w:rPr>
+              <w:t xml:space="preserve"> container, and the audit trail shows a </w:t>
+            </w:r>
+            <w:proofErr w:type="spellStart"/>
+            <w:r>
+              <w:rPr>
+                <w:sz w:val="20"/>
+                <w:szCs w:val="20"/>
+              </w:rPr>
+              <w:t>ZTERS</w:t>
+            </w:r>
+            <w:proofErr w:type="spellEnd"/>
+            <w:r>
+              <w:rPr>
+                <w:sz w:val="20"/>
+                <w:szCs w:val="20"/>
+              </w:rPr>
+              <w:t>-account edit within 60 seconds</w:t>
+            </w:r>
+          </w:p>
+        </w:tc>
+        <w:tc>
+          <w:tcPr>
+            <w:tcW w:w="3228" w:type="dxa"/>
+          </w:tcPr>
+          <w:p>
+            <w:pPr>
+              <w:rPr>
+                <w:rFonts w:cs="Arial"/>
+                <w:sz w:val="20"/>
+                <w:szCs w:val="20"/>
+              </w:rPr>
+            </w:pPr>
+            <w:r>
+              <w:rPr>
+                <w:sz w:val="20"/>
+                <w:szCs w:val="20"/>
+              </w:rPr>
+              <w:t xml:space="preserve">Service Update to Tago </w:t>
+            </w:r>
+          </w:p>
+        </w:tc>
+      </w:tr>
+    </w:tbl>
+    <w:p/>
+    <w:p/>
+    <w:p/>
+    <w:p>
+      <w:pPr>
+        <w:pStyle w:val="Heading1"/>
+        <w:sectPr>
+          <w:headerReference w:type="default" r:id="rId26"/>
+          <w:pgSz w:w="12240" w:h="15840"/>
+          <w:pgMar w:top="1411" w:right="850" w:bottom="1411" w:left="850" w:header="576" w:footer="720" w:gutter="0"/>
+          <w:pgNumType w:chapSep="period"/>
+          <w:cols w:space="720"/>
+          <w:docGrid w:linePitch="360"/>
+        </w:sectPr>
+      </w:pPr>
+    </w:p>
+    <w:p>
+      <w:pPr>
+        <w:pStyle w:val="Heading1"/>
+      </w:pPr>
+      <w:bookmarkStart w:id="27" w:name="_Toc241003260"/>
+      <w:r>
+        <w:lastRenderedPageBreak/>
+        <w:t>A</w:t>
+      </w:r>
+      <w:r>
+        <w:t>P</w:t>
+      </w:r>
+      <w:r>
+        <w:t>PENDIX A – JOBS AND COMMANDS OUTSIDE THE INTEGRATION</w:t>
+      </w:r>
+      <w:bookmarkEnd w:id="27"/>
+    </w:p>
+    <w:p>
+      <w:r>
+        <w:t xml:space="preserve">This appendix is recorded for the audit requirement in DIGDEV-62498. An earlier revision of the integration map presented these processes alongside the webhooks. They were subsequently identified as custom data-maintenance work that sits outside the integration </w:t>
+      </w:r>
+      <w:proofErr w:type="gramStart"/>
+      <w:r>
+        <w:t>proper</w:t>
+      </w:r>
+      <w:proofErr w:type="gramEnd"/>
+      <w:r>
+        <w:t xml:space="preserve"> and will be deleted along with the </w:t>
+      </w:r>
+      <w:proofErr w:type="spellStart"/>
+      <w:r>
+        <w:t>ZTERS</w:t>
+      </w:r>
+      <w:proofErr w:type="spellEnd"/>
+      <w:r>
+        <w:t xml:space="preserve"> extension.</w:t>
+      </w:r>
+    </w:p>
+    <w:tbl>
+      <w:tblPr>
+        <w:tblStyle w:val="TableGrid"/>
+        <w:tblW w:w="10615" w:type="dxa"/>
+        <w:tblBorders>
+          <w:top w:val="single" w:sz="4" w:space="0" w:color="D1D1D1" w:themeColor="background2" w:themeShade="E6"/>
+          <w:left w:val="single" w:sz="4" w:space="0" w:color="D1D1D1" w:themeColor="background2" w:themeShade="E6"/>
+          <w:bottom w:val="single" w:sz="4" w:space="0" w:color="D1D1D1" w:themeColor="background2" w:themeShade="E6"/>
+          <w:right w:val="single" w:sz="4" w:space="0" w:color="D1D1D1" w:themeColor="background2" w:themeShade="E6"/>
+          <w:insideH w:val="single" w:sz="4" w:space="0" w:color="D1D1D1" w:themeColor="background2" w:themeShade="E6"/>
+          <w:insideV w:val="single" w:sz="4" w:space="0" w:color="D1D1D1" w:themeColor="background2" w:themeShade="E6"/>
+        </w:tblBorders>
+        <w:tblLook w:val="04A0" w:firstRow="1" w:lastRow="0" w:firstColumn="1" w:lastColumn="0" w:noHBand="0" w:noVBand="1"/>
+      </w:tblPr>
+      <w:tblGrid>
+        <w:gridCol w:w="1975"/>
+        <w:gridCol w:w="2070"/>
+        <w:gridCol w:w="6570"/>
+      </w:tblGrid>
+      <w:tr>
+        <w:tc>
+          <w:tcPr>
+            <w:tcW w:w="1975" w:type="dxa"/>
+            <w:shd w:val="clear" w:color="auto" w:fill="4F7ABA"/>
+          </w:tcPr>
+          <w:p>
+            <w:pPr>
+              <w:rPr>
+                <w:b/>
+                <w:bCs/>
+                <w:color w:val="FFFFFF" w:themeColor="background1"/>
+                <w:sz w:val="20"/>
+                <w:szCs w:val="20"/>
+              </w:rPr>
+            </w:pPr>
+            <w:r>
+              <w:rPr>
+                <w:b/>
+                <w:bCs/>
+                <w:color w:val="FFFFFF" w:themeColor="background1"/>
+                <w:sz w:val="20"/>
+                <w:szCs w:val="20"/>
+              </w:rPr>
+              <w:t>Process</w:t>
+            </w:r>
+          </w:p>
+        </w:tc>
+        <w:tc>
+          <w:tcPr>
+            <w:tcW w:w="2070" w:type="dxa"/>
+            <w:shd w:val="clear" w:color="auto" w:fill="4F7ABA"/>
+          </w:tcPr>
+          <w:p>
+            <w:pPr>
+              <w:rPr>
+                <w:b/>
+                <w:bCs/>
+                <w:color w:val="FFFFFF" w:themeColor="background1"/>
+                <w:sz w:val="20"/>
+                <w:szCs w:val="20"/>
+              </w:rPr>
+            </w:pPr>
+            <w:r>
+              <w:rPr>
+                <w:b/>
+                <w:bCs/>
+                <w:color w:val="FFFFFF" w:themeColor="background1"/>
+                <w:sz w:val="20"/>
+                <w:szCs w:val="20"/>
+              </w:rPr>
+              <w:t>Type</w:t>
+            </w:r>
+          </w:p>
+        </w:tc>
+        <w:tc>
+          <w:tcPr>
+            <w:tcW w:w="6570" w:type="dxa"/>
+            <w:shd w:val="clear" w:color="auto" w:fill="4F7ABA"/>
+          </w:tcPr>
+          <w:p>
+            <w:pPr>
+              <w:rPr>
+                <w:b/>
+                <w:bCs/>
+                <w:color w:val="FFFFFF" w:themeColor="background1"/>
+                <w:sz w:val="20"/>
+                <w:szCs w:val="20"/>
+              </w:rPr>
+            </w:pPr>
+            <w:r>
+              <w:rPr>
+                <w:b/>
+                <w:bCs/>
+                <w:color w:val="FFFFFF" w:themeColor="background1"/>
+                <w:sz w:val="20"/>
+                <w:szCs w:val="20"/>
+              </w:rPr>
+              <w:t>What it does</w:t>
+            </w:r>
+          </w:p>
+        </w:tc>
+      </w:tr>
+      <w:tr>
+        <w:trPr>
+          <w:trHeight w:val="244"/>
+        </w:trPr>
+        <w:tc>
+          <w:tcPr>
+            <w:tcW w:w="1975" w:type="dxa"/>
+          </w:tcPr>
+          <w:p>
+            <w:pPr>
+              <w:rPr>
+                <w:rFonts w:cs="Arial"/>
+                <w:sz w:val="20"/>
+                <w:szCs w:val="20"/>
+              </w:rPr>
+            </w:pPr>
+            <w:r>
+              <w:t>sync-products --service-update</w:t>
+            </w:r>
+          </w:p>
+        </w:tc>
+        <w:tc>
+          <w:tcPr>
+            <w:tcW w:w="2070" w:type="dxa"/>
+          </w:tcPr>
+          <w:p>
+            <w:pPr>
+              <w:rPr>
+                <w:rFonts w:ascii="Consolas" w:hAnsi="Consolas" w:cs="Arial"/>
+                <w:sz w:val="20"/>
+                <w:szCs w:val="20"/>
+                <w:highlight w:val="lightGray"/>
+              </w:rPr>
+            </w:pPr>
+            <w:r>
+              <w:rPr>
+                <w:rFonts w:ascii="Consolas" w:hAnsi="Consolas"/>
+                <w:highlight w:val="lightGray"/>
+              </w:rPr>
+              <w:t>Cron, daily 04:00</w:t>
+            </w:r>
+          </w:p>
+        </w:tc>
+        <w:tc>
+          <w:tcPr>
+            <w:tcW w:w="6570" w:type="dxa"/>
+          </w:tcPr>
+          <w:p>
+            <w:pPr>
+              <w:rPr>
+                <w:rFonts w:cs="Arial"/>
+                <w:sz w:val="20"/>
+                <w:szCs w:val="20"/>
+              </w:rPr>
+            </w:pPr>
+            <w:r>
+              <w:t>Re-reads product size, content type and pickup days from QuickBase. Changed records also ping Tago, throttled at 0.5 s intervals.</w:t>
+            </w:r>
+          </w:p>
+        </w:tc>
+      </w:tr>
+      <w:tr>
+        <w:trPr>
+          <w:trHeight w:val="253"/>
+        </w:trPr>
+        <w:tc>
+          <w:tcPr>
+            <w:tcW w:w="1975" w:type="dxa"/>
+          </w:tcPr>
+          <w:p>
+            <w:pPr>
+              <w:rPr>
+                <w:rFonts w:cs="Arial"/>
+                <w:sz w:val="20"/>
+                <w:szCs w:val="20"/>
+              </w:rPr>
+            </w:pPr>
+            <w:r>
+              <w:t>import-records</w:t>
+            </w:r>
+          </w:p>
+        </w:tc>
+        <w:tc>
+          <w:tcPr>
+            <w:tcW w:w="2070" w:type="dxa"/>
+          </w:tcPr>
+          <w:p>
+            <w:pPr>
+              <w:rPr>
+                <w:rFonts w:ascii="Consolas" w:hAnsi="Consolas" w:cs="Arial"/>
+                <w:sz w:val="20"/>
+                <w:szCs w:val="20"/>
+                <w:highlight w:val="lightGray"/>
+              </w:rPr>
+            </w:pPr>
+            <w:r>
+              <w:rPr>
+                <w:rFonts w:ascii="Consolas" w:hAnsi="Consolas"/>
+                <w:highlight w:val="lightGray"/>
+              </w:rPr>
+              <w:t>Manual</w:t>
+            </w:r>
+          </w:p>
+        </w:tc>
+        <w:tc>
+          <w:tcPr>
+            <w:tcW w:w="6570" w:type="dxa"/>
+          </w:tcPr>
+          <w:p>
+            <w:pPr>
+              <w:rPr>
+                <w:rFonts w:cs="Arial"/>
+                <w:sz w:val="20"/>
+                <w:szCs w:val="20"/>
+              </w:rPr>
+            </w:pPr>
+            <w:proofErr w:type="gramStart"/>
+            <w:r>
+              <w:t>Runs</w:t>
+            </w:r>
+            <w:proofErr w:type="gramEnd"/>
+            <w:r>
+              <w:t xml:space="preserve"> the hauler quote pipeline in bulk. Described as no longer in routine use.</w:t>
+            </w:r>
+          </w:p>
+        </w:tc>
+      </w:tr>
+      <w:tr>
+        <w:tc>
+          <w:tcPr>
+            <w:tcW w:w="1975" w:type="dxa"/>
+          </w:tcPr>
+          <w:p>
+            <w:pPr>
+              <w:rPr>
+                <w:rFonts w:cs="Arial"/>
+                <w:sz w:val="20"/>
+                <w:szCs w:val="20"/>
+              </w:rPr>
+            </w:pPr>
+            <w:r>
+              <w:t>sync-asset-products</w:t>
+            </w:r>
+          </w:p>
+        </w:tc>
+        <w:tc>
+          <w:tcPr>
+            <w:tcW w:w="2070" w:type="dxa"/>
+          </w:tcPr>
+          <w:p>
+            <w:pPr>
+              <w:rPr>
+                <w:rFonts w:ascii="Consolas" w:hAnsi="Consolas" w:cs="Arial"/>
+                <w:sz w:val="20"/>
+                <w:szCs w:val="20"/>
+                <w:highlight w:val="lightGray"/>
+              </w:rPr>
+            </w:pPr>
+            <w:r>
+              <w:rPr>
+                <w:rFonts w:ascii="Consolas" w:hAnsi="Consolas"/>
+                <w:highlight w:val="lightGray"/>
+              </w:rPr>
+              <w:t>Manual</w:t>
+            </w:r>
+          </w:p>
+        </w:tc>
+        <w:tc>
+          <w:tcPr>
+            <w:tcW w:w="6570" w:type="dxa"/>
+          </w:tcPr>
+          <w:p>
+            <w:pPr>
+              <w:rPr>
+                <w:rFonts w:cs="Arial"/>
+                <w:sz w:val="20"/>
+                <w:szCs w:val="20"/>
+              </w:rPr>
+            </w:pPr>
+            <w:r>
+              <w:t>Re-links an asset to its product; optionally pings Tago afterwards.</w:t>
+            </w:r>
+          </w:p>
+        </w:tc>
+      </w:tr>
+      <w:tr>
+        <w:tc>
+          <w:tcPr>
+            <w:tcW w:w="1975" w:type="dxa"/>
+          </w:tcPr>
+          <w:p>
+            <w:pPr>
+              <w:rPr>
+                <w:rFonts w:cs="Arial"/>
+                <w:sz w:val="20"/>
+                <w:szCs w:val="20"/>
+              </w:rPr>
+            </w:pPr>
+            <w:r>
+              <w:t>import-installation-photos</w:t>
+            </w:r>
+          </w:p>
+        </w:tc>
+        <w:tc>
+          <w:tcPr>
+            <w:tcW w:w="2070" w:type="dxa"/>
+          </w:tcPr>
+          <w:p>
+            <w:pPr>
+              <w:rPr>
+                <w:rFonts w:ascii="Consolas" w:hAnsi="Consolas" w:cs="Arial"/>
+                <w:sz w:val="20"/>
+                <w:szCs w:val="20"/>
+                <w:highlight w:val="lightGray"/>
+              </w:rPr>
+            </w:pPr>
+            <w:r>
+              <w:rPr>
+                <w:rFonts w:ascii="Consolas" w:hAnsi="Consolas"/>
+                <w:highlight w:val="lightGray"/>
+              </w:rPr>
+              <w:t>Manual</w:t>
+            </w:r>
+          </w:p>
+        </w:tc>
+        <w:tc>
+          <w:tcPr>
+            <w:tcW w:w="6570" w:type="dxa"/>
+          </w:tcPr>
+          <w:p>
+            <w:pPr>
+              <w:rPr>
+                <w:rFonts w:cs="Arial"/>
+                <w:sz w:val="20"/>
+                <w:szCs w:val="20"/>
+              </w:rPr>
+            </w:pPr>
+            <w:r>
+              <w:t>Copies placement photos from the QuickBase file store into Azure Storage and links them to the asset.</w:t>
+            </w:r>
+          </w:p>
+        </w:tc>
+      </w:tr>
+      <w:tr>
+        <w:tc>
+          <w:tcPr>
+            <w:tcW w:w="1975" w:type="dxa"/>
+          </w:tcPr>
+          <w:p>
+            <w:pPr>
+              <w:rPr>
+                <w:sz w:val="20"/>
+                <w:szCs w:val="20"/>
+              </w:rPr>
+            </w:pPr>
+            <w:r>
+              <w:t>export-installation-status</w:t>
+            </w:r>
+          </w:p>
+        </w:tc>
+        <w:tc>
+          <w:tcPr>
+            <w:tcW w:w="2070" w:type="dxa"/>
+          </w:tcPr>
+          <w:p>
+            <w:pPr>
+              <w:rPr>
+                <w:rFonts w:ascii="Consolas" w:hAnsi="Consolas"/>
+                <w:sz w:val="20"/>
+                <w:szCs w:val="20"/>
+                <w:highlight w:val="lightGray"/>
+              </w:rPr>
+            </w:pPr>
+            <w:r>
+              <w:rPr>
+                <w:rFonts w:ascii="Consolas" w:hAnsi="Consolas"/>
+                <w:highlight w:val="lightGray"/>
+              </w:rPr>
+              <w:t>Manual batch</w:t>
+            </w:r>
+          </w:p>
+        </w:tc>
+        <w:tc>
+          <w:tcPr>
+            <w:tcW w:w="6570" w:type="dxa"/>
+          </w:tcPr>
+          <w:p>
+            <w:pPr>
+              <w:rPr>
+                <w:sz w:val="20"/>
+                <w:szCs w:val="20"/>
+              </w:rPr>
+            </w:pPr>
+            <w:r>
+              <w:t xml:space="preserve">Performs the section 10 write by hand across installed </w:t>
+            </w:r>
+            <w:proofErr w:type="spellStart"/>
+            <w:r>
+              <w:t>ZTERS</w:t>
+            </w:r>
+            <w:proofErr w:type="spellEnd"/>
+            <w:r>
+              <w:t xml:space="preserve"> assets instead of waiting on the event.</w:t>
+            </w:r>
+          </w:p>
+        </w:tc>
+      </w:tr>
+    </w:tbl>
+    <w:p>
+      <w:pPr>
+        <w:sectPr>
+          <w:headerReference w:type="default" r:id="rId27"/>
+          <w:pgSz w:w="12240" w:h="15840"/>
+          <w:pgMar w:top="1411" w:right="850" w:bottom="1411" w:left="850" w:header="576" w:footer="720" w:gutter="0"/>
+          <w:pgNumType w:chapSep="period"/>
+          <w:cols w:space="720"/>
+          <w:docGrid w:linePitch="360"/>
+        </w:sectPr>
+      </w:pPr>
+    </w:p>
+    <w:p>
+      <w:pPr>
+        <w:pStyle w:val="Heading1"/>
         <w:spacing w:after="360"/>
       </w:pPr>
-      <w:bookmarkStart w:id="23" w:name="_Toc240789707"/>
+      <w:bookmarkStart w:id="28" w:name="_Toc241003261"/>
       <w:r>
         <w:lastRenderedPageBreak/>
         <w:t>APPROVAL SIGNATURES</w:t>
       </w:r>
-      <w:bookmarkEnd w:id="23"/>
+      <w:bookmarkEnd w:id="28"/>
     </w:p>
     <w:p>
       <w:pPr>
@@ -11459,7 +13432,7 @@
     </w:p>
     <w:p/>
     <w:sectPr>
-      <w:headerReference w:type="default" r:id="rId17"/>
+      <w:headerReference w:type="default" r:id="rId28"/>
       <w:pgSz w:w="12240" w:h="15840"/>
       <w:pgMar w:top="1411" w:right="850" w:bottom="1411" w:left="850" w:header="576" w:footer="720" w:gutter="0"/>
       <w:pgNumType w:chapSep="period"/>
@@ -11953,6 +13926,418 @@
                 <wp:extent cx="326004" cy="378092"/>
                 <wp:effectExtent l="0" t="0" r="0" b="3175"/>
                 <wp:docPr id="372285848" name="Picture 1" descr="The Site Savvy Blog - News, trends, tips, and environmental knowledge."/>
+                <wp:cNvGraphicFramePr>
+                  <a:graphicFrameLocks xmlns:a="http://schemas.openxmlformats.org/drawingml/2006/main" noChangeAspect="1"/>
+                </wp:cNvGraphicFramePr>
+                <a:graphic xmlns:a="http://schemas.openxmlformats.org/drawingml/2006/main">
+                  <a:graphicData uri="http://schemas.openxmlformats.org/drawingml/2006/picture">
+                    <pic:pic xmlns:pic="http://schemas.openxmlformats.org/drawingml/2006/picture">
+                      <pic:nvPicPr>
+                        <pic:cNvPr id="0" name="Picture 1" descr="The Site Savvy Blog - News, trends, tips, and environmental knowledge."/>
+                        <pic:cNvPicPr>
+                          <a:picLocks noChangeAspect="1" noChangeArrowheads="1"/>
+                        </pic:cNvPicPr>
+                      </pic:nvPicPr>
+                      <pic:blipFill>
+                        <a:blip r:embed="rId1">
+                          <a:extLst>
+                            <a:ext uri="{28A0092B-C50C-407E-A947-70E740481C1C}">
+                              <a14:useLocalDpi xmlns:a14="http://schemas.microsoft.com/office/drawing/2010/main" val="0"/>
+                            </a:ext>
+                          </a:extLst>
+                        </a:blip>
+                        <a:srcRect/>
+                        <a:stretch>
+                          <a:fillRect/>
+                        </a:stretch>
+                      </pic:blipFill>
+                      <pic:spPr bwMode="auto">
+                        <a:xfrm rot="10800000" flipH="1" flipV="1">
+                          <a:off x="0" y="0"/>
+                          <a:ext cx="326004" cy="378092"/>
+                        </a:xfrm>
+                        <a:prstGeom prst="rect">
+                          <a:avLst/>
+                        </a:prstGeom>
+                        <a:noFill/>
+                        <a:ln>
+                          <a:noFill/>
+                        </a:ln>
+                      </pic:spPr>
+                    </pic:pic>
+                  </a:graphicData>
+                </a:graphic>
+              </wp:inline>
+            </w:drawing>
+          </w:r>
+        </w:p>
+      </w:tc>
+    </w:tr>
+  </w:tbl>
+  <w:p>
+    <w:pPr>
+      <w:pStyle w:val="Header"/>
+      <w:rPr>
+        <w:sz w:val="16"/>
+        <w:szCs w:val="16"/>
+      </w:rPr>
+    </w:pPr>
+  </w:p>
+</w:hdr>
+</file>
+
+<file path=word/header10.xml><?xml version="1.0" encoding="utf-8"?>
+<w:hdr xmlns:wpc="http://schemas.microsoft.com/office/word/2010/wordprocessingCanvas" xmlns:cx="http://schemas.microsoft.com/office/drawing/2014/chartex" xmlns:cx1="http://schemas.microsoft.com/office/drawing/2015/9/8/chartex" xmlns:cx2="http://schemas.microsoft.com/office/drawing/2015/10/21/chartex" xmlns:cx3="http://schemas.microsoft.com/office/drawing/2016/5/9/chartex" xmlns:cx4="http://schemas.microsoft.com/office/drawing/2016/5/10/chartex" xmlns:cx5="http://schemas.microsoft.com/office/drawing/2016/5/11/chartex" xmlns:cx6="http://schemas.microsoft.com/office/drawing/2016/5/12/chartex" xmlns:cx7="http://schemas.microsoft.com/office/drawing/2016/5/13/chartex" xmlns:cx8="http://schemas.microsoft.com/office/drawing/2016/5/14/chartex" xmlns:mc="http://schemas.openxmlformats.org/markup-compatibility/2006" xmlns:aink="http://schemas.microsoft.com/office/drawing/2016/ink" xmlns:am3d="http://schemas.microsoft.com/office/drawing/2017/model3d" xmlns:o="urn:schemas-microsoft-com:office:office" xmlns:oel="http://schemas.microsoft.com/office/2019/extlst" xmlns:r="http://schemas.openxmlformats.org/officeDocument/2006/relationships" xmlns:m="http://schemas.openxmlformats.org/officeDocument/2006/math" xmlns:v="urn:schemas-microsoft-com:vml" xmlns:wp14="http://schemas.microsoft.com/office/word/2010/wordprocessingDrawing" xmlns:wp="http://schemas.openxmlformats.org/drawingml/2006/wordprocessingDrawing" xmlns:w10="urn:schemas-microsoft-com:office:word" xmlns:w="http://schemas.openxmlformats.org/wordprocessingml/2006/main" xmlns:w14="http://schemas.microsoft.com/office/word/2010/wordml" xmlns:w15="http://schemas.microsoft.com/office/word/2012/wordml" xmlns:w16cex="http://schemas.microsoft.com/office/word/2018/wordml/cex" xmlns:w16cid="http://schemas.microsoft.com/office/word/2016/wordml/cid" xmlns:w16="http://schemas.microsoft.com/office/word/2018/wordml" xmlns:w16du="http://schemas.microsoft.com/office/word/2023/wordml/word16du" xmlns:w16sdtdh="http://schemas.microsoft.com/office/word/2020/wordml/sdtdatahash" xmlns:w16sdtfl="http://schemas.microsoft.com/office/word/2024/wordml/sdtformatlock" xmlns:w16se="http://schemas.microsoft.com/office/word/2015/wordml/symex" xmlns:wpg="http://schemas.microsoft.com/office/word/2010/wordprocessingGroup" xmlns:wpi="http://schemas.microsoft.com/office/word/2010/wordprocessingInk" xmlns:wne="http://schemas.microsoft.com/office/word/2006/wordml" xmlns:wps="http://schemas.microsoft.com/office/word/2010/wordprocessingShape" mc:Ignorable="w14 w15 w16se w16cid w16 w16cex w16sdtdh w16sdtfl w16du wp14">
+  <w:tbl>
+    <w:tblPr>
+      <w:tblStyle w:val="TableGrid"/>
+      <w:tblW w:w="0" w:type="auto"/>
+      <w:tblBorders>
+        <w:top w:val="none" w:sz="0" w:space="0" w:color="auto"/>
+        <w:left w:val="none" w:sz="0" w:space="0" w:color="auto"/>
+        <w:bottom w:val="none" w:sz="0" w:space="0" w:color="auto"/>
+        <w:right w:val="none" w:sz="0" w:space="0" w:color="auto"/>
+        <w:insideH w:val="none" w:sz="0" w:space="0" w:color="auto"/>
+        <w:insideV w:val="none" w:sz="0" w:space="0" w:color="auto"/>
+      </w:tblBorders>
+      <w:tblLook w:val="04A0" w:firstRow="1" w:lastRow="0" w:firstColumn="1" w:lastColumn="0" w:noHBand="0" w:noVBand="1"/>
+    </w:tblPr>
+    <w:tblGrid>
+      <w:gridCol w:w="9811"/>
+      <w:gridCol w:w="729"/>
+    </w:tblGrid>
+    <w:tr>
+      <w:tc>
+        <w:tcPr>
+          <w:tcW w:w="9895" w:type="dxa"/>
+        </w:tcPr>
+        <w:p>
+          <w:pPr>
+            <w:pStyle w:val="Header"/>
+            <w:rPr>
+              <w:sz w:val="16"/>
+              <w:szCs w:val="16"/>
+            </w:rPr>
+          </w:pPr>
+          <w:r>
+            <w:rPr>
+              <w:sz w:val="16"/>
+              <w:szCs w:val="16"/>
+            </w:rPr>
+            <w:t>ZSight –</w:t>
+          </w:r>
+          <w:r>
+            <w:rPr>
+              <w:sz w:val="16"/>
+              <w:szCs w:val="16"/>
+            </w:rPr>
+            <w:t xml:space="preserve"> </w:t>
+          </w:r>
+          <w:r>
+            <w:rPr>
+              <w:sz w:val="16"/>
+              <w:szCs w:val="16"/>
+            </w:rPr>
+            <w:t>Outbound Write to QuickBase</w:t>
+          </w:r>
+        </w:p>
+      </w:tc>
+      <w:tc>
+        <w:tcPr>
+          <w:tcW w:w="635" w:type="dxa"/>
+        </w:tcPr>
+        <w:p>
+          <w:pPr>
+            <w:pStyle w:val="Header"/>
+          </w:pPr>
+          <w:r>
+            <w:rPr>
+              <w:noProof/>
+              <w:sz w:val="16"/>
+              <w:szCs w:val="16"/>
+            </w:rPr>
+            <w:drawing>
+              <wp:inline distT="0" distB="0" distL="0" distR="0" wp14:anchorId="3852FCD0" wp14:editId="62B99033">
+                <wp:extent cx="326004" cy="378092"/>
+                <wp:effectExtent l="0" t="0" r="0" b="3175"/>
+                <wp:docPr id="757015110" name="Picture 1" descr="The Site Savvy Blog - News, trends, tips, and environmental knowledge."/>
+                <wp:cNvGraphicFramePr>
+                  <a:graphicFrameLocks xmlns:a="http://schemas.openxmlformats.org/drawingml/2006/main" noChangeAspect="1"/>
+                </wp:cNvGraphicFramePr>
+                <a:graphic xmlns:a="http://schemas.openxmlformats.org/drawingml/2006/main">
+                  <a:graphicData uri="http://schemas.openxmlformats.org/drawingml/2006/picture">
+                    <pic:pic xmlns:pic="http://schemas.openxmlformats.org/drawingml/2006/picture">
+                      <pic:nvPicPr>
+                        <pic:cNvPr id="0" name="Picture 1" descr="The Site Savvy Blog - News, trends, tips, and environmental knowledge."/>
+                        <pic:cNvPicPr>
+                          <a:picLocks noChangeAspect="1" noChangeArrowheads="1"/>
+                        </pic:cNvPicPr>
+                      </pic:nvPicPr>
+                      <pic:blipFill>
+                        <a:blip r:embed="rId1">
+                          <a:extLst>
+                            <a:ext uri="{28A0092B-C50C-407E-A947-70E740481C1C}">
+                              <a14:useLocalDpi xmlns:a14="http://schemas.microsoft.com/office/drawing/2010/main" val="0"/>
+                            </a:ext>
+                          </a:extLst>
+                        </a:blip>
+                        <a:srcRect/>
+                        <a:stretch>
+                          <a:fillRect/>
+                        </a:stretch>
+                      </pic:blipFill>
+                      <pic:spPr bwMode="auto">
+                        <a:xfrm rot="10800000" flipH="1" flipV="1">
+                          <a:off x="0" y="0"/>
+                          <a:ext cx="326004" cy="378092"/>
+                        </a:xfrm>
+                        <a:prstGeom prst="rect">
+                          <a:avLst/>
+                        </a:prstGeom>
+                        <a:noFill/>
+                        <a:ln>
+                          <a:noFill/>
+                        </a:ln>
+                      </pic:spPr>
+                    </pic:pic>
+                  </a:graphicData>
+                </a:graphic>
+              </wp:inline>
+            </w:drawing>
+          </w:r>
+        </w:p>
+      </w:tc>
+    </w:tr>
+  </w:tbl>
+  <w:p>
+    <w:pPr>
+      <w:pStyle w:val="Header"/>
+      <w:rPr>
+        <w:sz w:val="16"/>
+        <w:szCs w:val="16"/>
+      </w:rPr>
+    </w:pPr>
+  </w:p>
+</w:hdr>
+</file>
+
+<file path=word/header11.xml><?xml version="1.0" encoding="utf-8"?>
+<w:hdr xmlns:wpc="http://schemas.microsoft.com/office/word/2010/wordprocessingCanvas" xmlns:cx="http://schemas.microsoft.com/office/drawing/2014/chartex" xmlns:cx1="http://schemas.microsoft.com/office/drawing/2015/9/8/chartex" xmlns:cx2="http://schemas.microsoft.com/office/drawing/2015/10/21/chartex" xmlns:cx3="http://schemas.microsoft.com/office/drawing/2016/5/9/chartex" xmlns:cx4="http://schemas.microsoft.com/office/drawing/2016/5/10/chartex" xmlns:cx5="http://schemas.microsoft.com/office/drawing/2016/5/11/chartex" xmlns:cx6="http://schemas.microsoft.com/office/drawing/2016/5/12/chartex" xmlns:cx7="http://schemas.microsoft.com/office/drawing/2016/5/13/chartex" xmlns:cx8="http://schemas.microsoft.com/office/drawing/2016/5/14/chartex" xmlns:mc="http://schemas.openxmlformats.org/markup-compatibility/2006" xmlns:aink="http://schemas.microsoft.com/office/drawing/2016/ink" xmlns:am3d="http://schemas.microsoft.com/office/drawing/2017/model3d" xmlns:o="urn:schemas-microsoft-com:office:office" xmlns:oel="http://schemas.microsoft.com/office/2019/extlst" xmlns:r="http://schemas.openxmlformats.org/officeDocument/2006/relationships" xmlns:m="http://schemas.openxmlformats.org/officeDocument/2006/math" xmlns:v="urn:schemas-microsoft-com:vml" xmlns:wp14="http://schemas.microsoft.com/office/word/2010/wordprocessingDrawing" xmlns:wp="http://schemas.openxmlformats.org/drawingml/2006/wordprocessingDrawing" xmlns:w10="urn:schemas-microsoft-com:office:word" xmlns:w="http://schemas.openxmlformats.org/wordprocessingml/2006/main" xmlns:w14="http://schemas.microsoft.com/office/word/2010/wordml" xmlns:w15="http://schemas.microsoft.com/office/word/2012/wordml" xmlns:w16cex="http://schemas.microsoft.com/office/word/2018/wordml/cex" xmlns:w16cid="http://schemas.microsoft.com/office/word/2016/wordml/cid" xmlns:w16="http://schemas.microsoft.com/office/word/2018/wordml" xmlns:w16du="http://schemas.microsoft.com/office/word/2023/wordml/word16du" xmlns:w16sdtdh="http://schemas.microsoft.com/office/word/2020/wordml/sdtdatahash" xmlns:w16sdtfl="http://schemas.microsoft.com/office/word/2024/wordml/sdtformatlock" xmlns:w16se="http://schemas.microsoft.com/office/word/2015/wordml/symex" xmlns:wpg="http://schemas.microsoft.com/office/word/2010/wordprocessingGroup" xmlns:wpi="http://schemas.microsoft.com/office/word/2010/wordprocessingInk" xmlns:wne="http://schemas.microsoft.com/office/word/2006/wordml" xmlns:wps="http://schemas.microsoft.com/office/word/2010/wordprocessingShape" mc:Ignorable="w14 w15 w16se w16cid w16 w16cex w16sdtdh w16sdtfl w16du wp14">
+  <w:tbl>
+    <w:tblPr>
+      <w:tblStyle w:val="TableGrid"/>
+      <w:tblW w:w="0" w:type="auto"/>
+      <w:tblBorders>
+        <w:top w:val="none" w:sz="0" w:space="0" w:color="auto"/>
+        <w:left w:val="none" w:sz="0" w:space="0" w:color="auto"/>
+        <w:bottom w:val="none" w:sz="0" w:space="0" w:color="auto"/>
+        <w:right w:val="none" w:sz="0" w:space="0" w:color="auto"/>
+        <w:insideH w:val="none" w:sz="0" w:space="0" w:color="auto"/>
+        <w:insideV w:val="none" w:sz="0" w:space="0" w:color="auto"/>
+      </w:tblBorders>
+      <w:tblLook w:val="04A0" w:firstRow="1" w:lastRow="0" w:firstColumn="1" w:lastColumn="0" w:noHBand="0" w:noVBand="1"/>
+    </w:tblPr>
+    <w:tblGrid>
+      <w:gridCol w:w="9811"/>
+      <w:gridCol w:w="729"/>
+    </w:tblGrid>
+    <w:tr>
+      <w:tc>
+        <w:tcPr>
+          <w:tcW w:w="9895" w:type="dxa"/>
+        </w:tcPr>
+        <w:p>
+          <w:pPr>
+            <w:pStyle w:val="Header"/>
+            <w:rPr>
+              <w:sz w:val="16"/>
+              <w:szCs w:val="16"/>
+            </w:rPr>
+          </w:pPr>
+          <w:r>
+            <w:rPr>
+              <w:sz w:val="16"/>
+              <w:szCs w:val="16"/>
+            </w:rPr>
+            <w:t>ZSight –</w:t>
+          </w:r>
+          <w:r>
+            <w:rPr>
+              <w:sz w:val="16"/>
+              <w:szCs w:val="16"/>
+            </w:rPr>
+            <w:t xml:space="preserve"> </w:t>
+          </w:r>
+          <w:r>
+            <w:rPr>
+              <w:sz w:val="16"/>
+              <w:szCs w:val="16"/>
+            </w:rPr>
+            <w:t>Appendix A – Jobs and Command Outside the Integration</w:t>
+          </w:r>
+        </w:p>
+      </w:tc>
+      <w:tc>
+        <w:tcPr>
+          <w:tcW w:w="635" w:type="dxa"/>
+        </w:tcPr>
+        <w:p>
+          <w:pPr>
+            <w:pStyle w:val="Header"/>
+          </w:pPr>
+          <w:r>
+            <w:rPr>
+              <w:noProof/>
+              <w:sz w:val="16"/>
+              <w:szCs w:val="16"/>
+            </w:rPr>
+            <w:drawing>
+              <wp:inline distT="0" distB="0" distL="0" distR="0" wp14:anchorId="7092F1F5" wp14:editId="50592ABB">
+                <wp:extent cx="326004" cy="378092"/>
+                <wp:effectExtent l="0" t="0" r="0" b="3175"/>
+                <wp:docPr id="1171113093" name="Picture 1" descr="The Site Savvy Blog - News, trends, tips, and environmental knowledge."/>
+                <wp:cNvGraphicFramePr>
+                  <a:graphicFrameLocks xmlns:a="http://schemas.openxmlformats.org/drawingml/2006/main" noChangeAspect="1"/>
+                </wp:cNvGraphicFramePr>
+                <a:graphic xmlns:a="http://schemas.openxmlformats.org/drawingml/2006/main">
+                  <a:graphicData uri="http://schemas.openxmlformats.org/drawingml/2006/picture">
+                    <pic:pic xmlns:pic="http://schemas.openxmlformats.org/drawingml/2006/picture">
+                      <pic:nvPicPr>
+                        <pic:cNvPr id="0" name="Picture 1" descr="The Site Savvy Blog - News, trends, tips, and environmental knowledge."/>
+                        <pic:cNvPicPr>
+                          <a:picLocks noChangeAspect="1" noChangeArrowheads="1"/>
+                        </pic:cNvPicPr>
+                      </pic:nvPicPr>
+                      <pic:blipFill>
+                        <a:blip r:embed="rId1">
+                          <a:extLst>
+                            <a:ext uri="{28A0092B-C50C-407E-A947-70E740481C1C}">
+                              <a14:useLocalDpi xmlns:a14="http://schemas.microsoft.com/office/drawing/2010/main" val="0"/>
+                            </a:ext>
+                          </a:extLst>
+                        </a:blip>
+                        <a:srcRect/>
+                        <a:stretch>
+                          <a:fillRect/>
+                        </a:stretch>
+                      </pic:blipFill>
+                      <pic:spPr bwMode="auto">
+                        <a:xfrm rot="10800000" flipH="1" flipV="1">
+                          <a:off x="0" y="0"/>
+                          <a:ext cx="326004" cy="378092"/>
+                        </a:xfrm>
+                        <a:prstGeom prst="rect">
+                          <a:avLst/>
+                        </a:prstGeom>
+                        <a:noFill/>
+                        <a:ln>
+                          <a:noFill/>
+                        </a:ln>
+                      </pic:spPr>
+                    </pic:pic>
+                  </a:graphicData>
+                </a:graphic>
+              </wp:inline>
+            </w:drawing>
+          </w:r>
+        </w:p>
+      </w:tc>
+    </w:tr>
+  </w:tbl>
+  <w:p>
+    <w:pPr>
+      <w:pStyle w:val="Header"/>
+      <w:rPr>
+        <w:sz w:val="16"/>
+        <w:szCs w:val="16"/>
+      </w:rPr>
+    </w:pPr>
+  </w:p>
+</w:hdr>
+</file>
+
+<file path=word/header12.xml><?xml version="1.0" encoding="utf-8"?>
+<w:hdr xmlns:wpc="http://schemas.microsoft.com/office/word/2010/wordprocessingCanvas" xmlns:cx="http://schemas.microsoft.com/office/drawing/2014/chartex" xmlns:cx1="http://schemas.microsoft.com/office/drawing/2015/9/8/chartex" xmlns:cx2="http://schemas.microsoft.com/office/drawing/2015/10/21/chartex" xmlns:cx3="http://schemas.microsoft.com/office/drawing/2016/5/9/chartex" xmlns:cx4="http://schemas.microsoft.com/office/drawing/2016/5/10/chartex" xmlns:cx5="http://schemas.microsoft.com/office/drawing/2016/5/11/chartex" xmlns:cx6="http://schemas.microsoft.com/office/drawing/2016/5/12/chartex" xmlns:cx7="http://schemas.microsoft.com/office/drawing/2016/5/13/chartex" xmlns:cx8="http://schemas.microsoft.com/office/drawing/2016/5/14/chartex" xmlns:mc="http://schemas.openxmlformats.org/markup-compatibility/2006" xmlns:aink="http://schemas.microsoft.com/office/drawing/2016/ink" xmlns:am3d="http://schemas.microsoft.com/office/drawing/2017/model3d" xmlns:o="urn:schemas-microsoft-com:office:office" xmlns:oel="http://schemas.microsoft.com/office/2019/extlst" xmlns:r="http://schemas.openxmlformats.org/officeDocument/2006/relationships" xmlns:m="http://schemas.openxmlformats.org/officeDocument/2006/math" xmlns:v="urn:schemas-microsoft-com:vml" xmlns:wp14="http://schemas.microsoft.com/office/word/2010/wordprocessingDrawing" xmlns:wp="http://schemas.openxmlformats.org/drawingml/2006/wordprocessingDrawing" xmlns:w10="urn:schemas-microsoft-com:office:word" xmlns:w="http://schemas.openxmlformats.org/wordprocessingml/2006/main" xmlns:w14="http://schemas.microsoft.com/office/word/2010/wordml" xmlns:w15="http://schemas.microsoft.com/office/word/2012/wordml" xmlns:w16cex="http://schemas.microsoft.com/office/word/2018/wordml/cex" xmlns:w16cid="http://schemas.microsoft.com/office/word/2016/wordml/cid" xmlns:w16="http://schemas.microsoft.com/office/word/2018/wordml" xmlns:w16du="http://schemas.microsoft.com/office/word/2023/wordml/word16du" xmlns:w16sdtdh="http://schemas.microsoft.com/office/word/2020/wordml/sdtdatahash" xmlns:w16sdtfl="http://schemas.microsoft.com/office/word/2024/wordml/sdtformatlock" xmlns:w16se="http://schemas.microsoft.com/office/word/2015/wordml/symex" xmlns:wpg="http://schemas.microsoft.com/office/word/2010/wordprocessingGroup" xmlns:wpi="http://schemas.microsoft.com/office/word/2010/wordprocessingInk" xmlns:wne="http://schemas.microsoft.com/office/word/2006/wordml" xmlns:wps="http://schemas.microsoft.com/office/word/2010/wordprocessingShape" mc:Ignorable="w14 w15 w16se w16cid w16 w16cex w16sdtdh w16sdtfl w16du wp14">
+  <w:tbl>
+    <w:tblPr>
+      <w:tblStyle w:val="TableGrid"/>
+      <w:tblW w:w="0" w:type="auto"/>
+      <w:tblBorders>
+        <w:top w:val="none" w:sz="0" w:space="0" w:color="auto"/>
+        <w:left w:val="none" w:sz="0" w:space="0" w:color="auto"/>
+        <w:bottom w:val="none" w:sz="0" w:space="0" w:color="auto"/>
+        <w:right w:val="none" w:sz="0" w:space="0" w:color="auto"/>
+        <w:insideH w:val="none" w:sz="0" w:space="0" w:color="auto"/>
+        <w:insideV w:val="none" w:sz="0" w:space="0" w:color="auto"/>
+      </w:tblBorders>
+      <w:tblLook w:val="04A0" w:firstRow="1" w:lastRow="0" w:firstColumn="1" w:lastColumn="0" w:noHBand="0" w:noVBand="1"/>
+    </w:tblPr>
+    <w:tblGrid>
+      <w:gridCol w:w="9811"/>
+      <w:gridCol w:w="729"/>
+    </w:tblGrid>
+    <w:tr>
+      <w:tc>
+        <w:tcPr>
+          <w:tcW w:w="9895" w:type="dxa"/>
+        </w:tcPr>
+        <w:p>
+          <w:pPr>
+            <w:pStyle w:val="Header"/>
+            <w:rPr>
+              <w:sz w:val="16"/>
+              <w:szCs w:val="16"/>
+            </w:rPr>
+          </w:pPr>
+          <w:r>
+            <w:rPr>
+              <w:sz w:val="16"/>
+              <w:szCs w:val="16"/>
+            </w:rPr>
+            <w:t>ZSight</w:t>
+          </w:r>
+          <w:r>
+            <w:rPr>
+              <w:sz w:val="16"/>
+              <w:szCs w:val="16"/>
+            </w:rPr>
+            <w:t xml:space="preserve"> –</w:t>
+          </w:r>
+          <w:r>
+            <w:rPr>
+              <w:sz w:val="16"/>
+              <w:szCs w:val="16"/>
+            </w:rPr>
+            <w:t xml:space="preserve"> </w:t>
+          </w:r>
+          <w:r>
+            <w:rPr>
+              <w:sz w:val="16"/>
+              <w:szCs w:val="16"/>
+            </w:rPr>
+            <w:t>Approval Signatures</w:t>
+          </w:r>
+        </w:p>
+      </w:tc>
+      <w:tc>
+        <w:tcPr>
+          <w:tcW w:w="635" w:type="dxa"/>
+        </w:tcPr>
+        <w:p>
+          <w:pPr>
+            <w:pStyle w:val="Header"/>
+          </w:pPr>
+          <w:r>
+            <w:rPr>
+              <w:noProof/>
+              <w:sz w:val="16"/>
+              <w:szCs w:val="16"/>
+            </w:rPr>
+            <w:drawing>
+              <wp:inline distT="0" distB="0" distL="0" distR="0" wp14:anchorId="27C7A390" wp14:editId="30DA96FE">
+                <wp:extent cx="326004" cy="378092"/>
+                <wp:effectExtent l="0" t="0" r="0" b="3175"/>
+                <wp:docPr id="878039000" name="Picture 1" descr="The Site Savvy Blog - News, trends, tips, and environmental knowledge."/>
                 <wp:cNvGraphicFramePr>
                   <a:graphicFrameLocks xmlns:a="http://schemas.openxmlformats.org/drawingml/2006/main" noChangeAspect="1"/>
                 </wp:cNvGraphicFramePr>
@@ -12461,7 +14846,7 @@
               <w:sz w:val="16"/>
               <w:szCs w:val="16"/>
             </w:rPr>
-            <w:t>SOP –</w:t>
+            <w:t>ZSight –</w:t>
           </w:r>
           <w:r>
             <w:rPr>
@@ -12475,7 +14860,7 @@
               <w:sz w:val="16"/>
               <w:szCs w:val="16"/>
             </w:rPr>
-            <w:t>Approval Signatures</w:t>
+            <w:t>API Surfaces</w:t>
           </w:r>
         </w:p>
       </w:tc>
@@ -12494,10 +14879,550 @@
               <w:szCs w:val="16"/>
             </w:rPr>
             <w:drawing>
-              <wp:inline distT="0" distB="0" distL="0" distR="0" wp14:anchorId="27C7A390" wp14:editId="30DA96FE">
+              <wp:inline distT="0" distB="0" distL="0" distR="0" wp14:anchorId="53A95272" wp14:editId="21CCC279">
                 <wp:extent cx="326004" cy="378092"/>
                 <wp:effectExtent l="0" t="0" r="0" b="3175"/>
-                <wp:docPr id="878039000" name="Picture 1" descr="The Site Savvy Blog - News, trends, tips, and environmental knowledge."/>
+                <wp:docPr id="556047374" name="Picture 1" descr="The Site Savvy Blog - News, trends, tips, and environmental knowledge."/>
+                <wp:cNvGraphicFramePr>
+                  <a:graphicFrameLocks xmlns:a="http://schemas.openxmlformats.org/drawingml/2006/main" noChangeAspect="1"/>
+                </wp:cNvGraphicFramePr>
+                <a:graphic xmlns:a="http://schemas.openxmlformats.org/drawingml/2006/main">
+                  <a:graphicData uri="http://schemas.openxmlformats.org/drawingml/2006/picture">
+                    <pic:pic xmlns:pic="http://schemas.openxmlformats.org/drawingml/2006/picture">
+                      <pic:nvPicPr>
+                        <pic:cNvPr id="0" name="Picture 1" descr="The Site Savvy Blog - News, trends, tips, and environmental knowledge."/>
+                        <pic:cNvPicPr>
+                          <a:picLocks noChangeAspect="1" noChangeArrowheads="1"/>
+                        </pic:cNvPicPr>
+                      </pic:nvPicPr>
+                      <pic:blipFill>
+                        <a:blip r:embed="rId1">
+                          <a:extLst>
+                            <a:ext uri="{28A0092B-C50C-407E-A947-70E740481C1C}">
+                              <a14:useLocalDpi xmlns:a14="http://schemas.microsoft.com/office/drawing/2010/main" val="0"/>
+                            </a:ext>
+                          </a:extLst>
+                        </a:blip>
+                        <a:srcRect/>
+                        <a:stretch>
+                          <a:fillRect/>
+                        </a:stretch>
+                      </pic:blipFill>
+                      <pic:spPr bwMode="auto">
+                        <a:xfrm rot="10800000" flipH="1" flipV="1">
+                          <a:off x="0" y="0"/>
+                          <a:ext cx="326004" cy="378092"/>
+                        </a:xfrm>
+                        <a:prstGeom prst="rect">
+                          <a:avLst/>
+                        </a:prstGeom>
+                        <a:noFill/>
+                        <a:ln>
+                          <a:noFill/>
+                        </a:ln>
+                      </pic:spPr>
+                    </pic:pic>
+                  </a:graphicData>
+                </a:graphic>
+              </wp:inline>
+            </w:drawing>
+          </w:r>
+        </w:p>
+      </w:tc>
+    </w:tr>
+  </w:tbl>
+  <w:p>
+    <w:pPr>
+      <w:pStyle w:val="Header"/>
+      <w:rPr>
+        <w:sz w:val="16"/>
+        <w:szCs w:val="16"/>
+      </w:rPr>
+    </w:pPr>
+  </w:p>
+</w:hdr>
+</file>
+
+<file path=word/header6.xml><?xml version="1.0" encoding="utf-8"?>
+<w:hdr xmlns:wpc="http://schemas.microsoft.com/office/word/2010/wordprocessingCanvas" xmlns:cx="http://schemas.microsoft.com/office/drawing/2014/chartex" xmlns:cx1="http://schemas.microsoft.com/office/drawing/2015/9/8/chartex" xmlns:cx2="http://schemas.microsoft.com/office/drawing/2015/10/21/chartex" xmlns:cx3="http://schemas.microsoft.com/office/drawing/2016/5/9/chartex" xmlns:cx4="http://schemas.microsoft.com/office/drawing/2016/5/10/chartex" xmlns:cx5="http://schemas.microsoft.com/office/drawing/2016/5/11/chartex" xmlns:cx6="http://schemas.microsoft.com/office/drawing/2016/5/12/chartex" xmlns:cx7="http://schemas.microsoft.com/office/drawing/2016/5/13/chartex" xmlns:cx8="http://schemas.microsoft.com/office/drawing/2016/5/14/chartex" xmlns:mc="http://schemas.openxmlformats.org/markup-compatibility/2006" xmlns:aink="http://schemas.microsoft.com/office/drawing/2016/ink" xmlns:am3d="http://schemas.microsoft.com/office/drawing/2017/model3d" xmlns:o="urn:schemas-microsoft-com:office:office" xmlns:oel="http://schemas.microsoft.com/office/2019/extlst" xmlns:r="http://schemas.openxmlformats.org/officeDocument/2006/relationships" xmlns:m="http://schemas.openxmlformats.org/officeDocument/2006/math" xmlns:v="urn:schemas-microsoft-com:vml" xmlns:wp14="http://schemas.microsoft.com/office/word/2010/wordprocessingDrawing" xmlns:wp="http://schemas.openxmlformats.org/drawingml/2006/wordprocessingDrawing" xmlns:w10="urn:schemas-microsoft-com:office:word" xmlns:w="http://schemas.openxmlformats.org/wordprocessingml/2006/main" xmlns:w14="http://schemas.microsoft.com/office/word/2010/wordml" xmlns:w15="http://schemas.microsoft.com/office/word/2012/wordml" xmlns:w16cex="http://schemas.microsoft.com/office/word/2018/wordml/cex" xmlns:w16cid="http://schemas.microsoft.com/office/word/2016/wordml/cid" xmlns:w16="http://schemas.microsoft.com/office/word/2018/wordml" xmlns:w16du="http://schemas.microsoft.com/office/word/2023/wordml/word16du" xmlns:w16sdtdh="http://schemas.microsoft.com/office/word/2020/wordml/sdtdatahash" xmlns:w16sdtfl="http://schemas.microsoft.com/office/word/2024/wordml/sdtformatlock" xmlns:w16se="http://schemas.microsoft.com/office/word/2015/wordml/symex" xmlns:wpg="http://schemas.microsoft.com/office/word/2010/wordprocessingGroup" xmlns:wpi="http://schemas.microsoft.com/office/word/2010/wordprocessingInk" xmlns:wne="http://schemas.microsoft.com/office/word/2006/wordml" xmlns:wps="http://schemas.microsoft.com/office/word/2010/wordprocessingShape" mc:Ignorable="w14 w15 w16se w16cid w16 w16cex w16sdtdh w16sdtfl w16du wp14">
+  <w:tbl>
+    <w:tblPr>
+      <w:tblStyle w:val="TableGrid"/>
+      <w:tblW w:w="0" w:type="auto"/>
+      <w:tblBorders>
+        <w:top w:val="none" w:sz="0" w:space="0" w:color="auto"/>
+        <w:left w:val="none" w:sz="0" w:space="0" w:color="auto"/>
+        <w:bottom w:val="none" w:sz="0" w:space="0" w:color="auto"/>
+        <w:right w:val="none" w:sz="0" w:space="0" w:color="auto"/>
+        <w:insideH w:val="none" w:sz="0" w:space="0" w:color="auto"/>
+        <w:insideV w:val="none" w:sz="0" w:space="0" w:color="auto"/>
+      </w:tblBorders>
+      <w:tblLook w:val="04A0" w:firstRow="1" w:lastRow="0" w:firstColumn="1" w:lastColumn="0" w:noHBand="0" w:noVBand="1"/>
+    </w:tblPr>
+    <w:tblGrid>
+      <w:gridCol w:w="9811"/>
+      <w:gridCol w:w="729"/>
+    </w:tblGrid>
+    <w:tr>
+      <w:tc>
+        <w:tcPr>
+          <w:tcW w:w="9895" w:type="dxa"/>
+        </w:tcPr>
+        <w:p>
+          <w:pPr>
+            <w:pStyle w:val="Header"/>
+            <w:rPr>
+              <w:sz w:val="16"/>
+              <w:szCs w:val="16"/>
+            </w:rPr>
+          </w:pPr>
+          <w:r>
+            <w:rPr>
+              <w:sz w:val="16"/>
+              <w:szCs w:val="16"/>
+            </w:rPr>
+            <w:t>ZSight –</w:t>
+          </w:r>
+          <w:r>
+            <w:rPr>
+              <w:sz w:val="16"/>
+              <w:szCs w:val="16"/>
+            </w:rPr>
+            <w:t xml:space="preserve"> </w:t>
+          </w:r>
+          <w:r>
+            <w:rPr>
+              <w:sz w:val="16"/>
+              <w:szCs w:val="16"/>
+            </w:rPr>
+            <w:t>Container Provisioning</w:t>
+          </w:r>
+        </w:p>
+      </w:tc>
+      <w:tc>
+        <w:tcPr>
+          <w:tcW w:w="635" w:type="dxa"/>
+        </w:tcPr>
+        <w:p>
+          <w:pPr>
+            <w:pStyle w:val="Header"/>
+          </w:pPr>
+          <w:r>
+            <w:rPr>
+              <w:noProof/>
+              <w:sz w:val="16"/>
+              <w:szCs w:val="16"/>
+            </w:rPr>
+            <w:drawing>
+              <wp:inline distT="0" distB="0" distL="0" distR="0" wp14:anchorId="2339D671" wp14:editId="7CE482B1">
+                <wp:extent cx="326004" cy="378092"/>
+                <wp:effectExtent l="0" t="0" r="0" b="3175"/>
+                <wp:docPr id="335558894" name="Picture 1" descr="The Site Savvy Blog - News, trends, tips, and environmental knowledge."/>
+                <wp:cNvGraphicFramePr>
+                  <a:graphicFrameLocks xmlns:a="http://schemas.openxmlformats.org/drawingml/2006/main" noChangeAspect="1"/>
+                </wp:cNvGraphicFramePr>
+                <a:graphic xmlns:a="http://schemas.openxmlformats.org/drawingml/2006/main">
+                  <a:graphicData uri="http://schemas.openxmlformats.org/drawingml/2006/picture">
+                    <pic:pic xmlns:pic="http://schemas.openxmlformats.org/drawingml/2006/picture">
+                      <pic:nvPicPr>
+                        <pic:cNvPr id="0" name="Picture 1" descr="The Site Savvy Blog - News, trends, tips, and environmental knowledge."/>
+                        <pic:cNvPicPr>
+                          <a:picLocks noChangeAspect="1" noChangeArrowheads="1"/>
+                        </pic:cNvPicPr>
+                      </pic:nvPicPr>
+                      <pic:blipFill>
+                        <a:blip r:embed="rId1">
+                          <a:extLst>
+                            <a:ext uri="{28A0092B-C50C-407E-A947-70E740481C1C}">
+                              <a14:useLocalDpi xmlns:a14="http://schemas.microsoft.com/office/drawing/2010/main" val="0"/>
+                            </a:ext>
+                          </a:extLst>
+                        </a:blip>
+                        <a:srcRect/>
+                        <a:stretch>
+                          <a:fillRect/>
+                        </a:stretch>
+                      </pic:blipFill>
+                      <pic:spPr bwMode="auto">
+                        <a:xfrm rot="10800000" flipH="1" flipV="1">
+                          <a:off x="0" y="0"/>
+                          <a:ext cx="326004" cy="378092"/>
+                        </a:xfrm>
+                        <a:prstGeom prst="rect">
+                          <a:avLst/>
+                        </a:prstGeom>
+                        <a:noFill/>
+                        <a:ln>
+                          <a:noFill/>
+                        </a:ln>
+                      </pic:spPr>
+                    </pic:pic>
+                  </a:graphicData>
+                </a:graphic>
+              </wp:inline>
+            </w:drawing>
+          </w:r>
+        </w:p>
+      </w:tc>
+    </w:tr>
+  </w:tbl>
+  <w:p>
+    <w:pPr>
+      <w:pStyle w:val="Header"/>
+      <w:rPr>
+        <w:sz w:val="16"/>
+        <w:szCs w:val="16"/>
+      </w:rPr>
+    </w:pPr>
+  </w:p>
+</w:hdr>
+</file>
+
+<file path=word/header7.xml><?xml version="1.0" encoding="utf-8"?>
+<w:hdr xmlns:wpc="http://schemas.microsoft.com/office/word/2010/wordprocessingCanvas" xmlns:cx="http://schemas.microsoft.com/office/drawing/2014/chartex" xmlns:cx1="http://schemas.microsoft.com/office/drawing/2015/9/8/chartex" xmlns:cx2="http://schemas.microsoft.com/office/drawing/2015/10/21/chartex" xmlns:cx3="http://schemas.microsoft.com/office/drawing/2016/5/9/chartex" xmlns:cx4="http://schemas.microsoft.com/office/drawing/2016/5/10/chartex" xmlns:cx5="http://schemas.microsoft.com/office/drawing/2016/5/11/chartex" xmlns:cx6="http://schemas.microsoft.com/office/drawing/2016/5/12/chartex" xmlns:cx7="http://schemas.microsoft.com/office/drawing/2016/5/13/chartex" xmlns:cx8="http://schemas.microsoft.com/office/drawing/2016/5/14/chartex" xmlns:mc="http://schemas.openxmlformats.org/markup-compatibility/2006" xmlns:aink="http://schemas.microsoft.com/office/drawing/2016/ink" xmlns:am3d="http://schemas.microsoft.com/office/drawing/2017/model3d" xmlns:o="urn:schemas-microsoft-com:office:office" xmlns:oel="http://schemas.microsoft.com/office/2019/extlst" xmlns:r="http://schemas.openxmlformats.org/officeDocument/2006/relationships" xmlns:m="http://schemas.openxmlformats.org/officeDocument/2006/math" xmlns:v="urn:schemas-microsoft-com:vml" xmlns:wp14="http://schemas.microsoft.com/office/word/2010/wordprocessingDrawing" xmlns:wp="http://schemas.openxmlformats.org/drawingml/2006/wordprocessingDrawing" xmlns:w10="urn:schemas-microsoft-com:office:word" xmlns:w="http://schemas.openxmlformats.org/wordprocessingml/2006/main" xmlns:w14="http://schemas.microsoft.com/office/word/2010/wordml" xmlns:w15="http://schemas.microsoft.com/office/word/2012/wordml" xmlns:w16cex="http://schemas.microsoft.com/office/word/2018/wordml/cex" xmlns:w16cid="http://schemas.microsoft.com/office/word/2016/wordml/cid" xmlns:w16="http://schemas.microsoft.com/office/word/2018/wordml" xmlns:w16du="http://schemas.microsoft.com/office/word/2023/wordml/word16du" xmlns:w16sdtdh="http://schemas.microsoft.com/office/word/2020/wordml/sdtdatahash" xmlns:w16sdtfl="http://schemas.microsoft.com/office/word/2024/wordml/sdtformatlock" xmlns:w16se="http://schemas.microsoft.com/office/word/2015/wordml/symex" xmlns:wpg="http://schemas.microsoft.com/office/word/2010/wordprocessingGroup" xmlns:wpi="http://schemas.microsoft.com/office/word/2010/wordprocessingInk" xmlns:wne="http://schemas.microsoft.com/office/word/2006/wordml" xmlns:wps="http://schemas.microsoft.com/office/word/2010/wordprocessingShape" mc:Ignorable="w14 w15 w16se w16cid w16 w16cex w16sdtdh w16sdtfl w16du wp14">
+  <w:tbl>
+    <w:tblPr>
+      <w:tblStyle w:val="TableGrid"/>
+      <w:tblW w:w="0" w:type="auto"/>
+      <w:tblBorders>
+        <w:top w:val="none" w:sz="0" w:space="0" w:color="auto"/>
+        <w:left w:val="none" w:sz="0" w:space="0" w:color="auto"/>
+        <w:bottom w:val="none" w:sz="0" w:space="0" w:color="auto"/>
+        <w:right w:val="none" w:sz="0" w:space="0" w:color="auto"/>
+        <w:insideH w:val="none" w:sz="0" w:space="0" w:color="auto"/>
+        <w:insideV w:val="none" w:sz="0" w:space="0" w:color="auto"/>
+      </w:tblBorders>
+      <w:tblLook w:val="04A0" w:firstRow="1" w:lastRow="0" w:firstColumn="1" w:lastColumn="0" w:noHBand="0" w:noVBand="1"/>
+    </w:tblPr>
+    <w:tblGrid>
+      <w:gridCol w:w="9811"/>
+      <w:gridCol w:w="729"/>
+    </w:tblGrid>
+    <w:tr>
+      <w:tc>
+        <w:tcPr>
+          <w:tcW w:w="9895" w:type="dxa"/>
+        </w:tcPr>
+        <w:p>
+          <w:pPr>
+            <w:pStyle w:val="Header"/>
+            <w:rPr>
+              <w:sz w:val="16"/>
+              <w:szCs w:val="16"/>
+            </w:rPr>
+          </w:pPr>
+          <w:r>
+            <w:rPr>
+              <w:sz w:val="16"/>
+              <w:szCs w:val="16"/>
+            </w:rPr>
+            <w:t>ZSight –</w:t>
+          </w:r>
+          <w:r>
+            <w:rPr>
+              <w:sz w:val="16"/>
+              <w:szCs w:val="16"/>
+            </w:rPr>
+            <w:t xml:space="preserve"> </w:t>
+          </w:r>
+          <w:r>
+            <w:rPr>
+              <w:sz w:val="16"/>
+              <w:szCs w:val="16"/>
+            </w:rPr>
+            <w:t>Container Status Lifecycle</w:t>
+          </w:r>
+        </w:p>
+      </w:tc>
+      <w:tc>
+        <w:tcPr>
+          <w:tcW w:w="635" w:type="dxa"/>
+        </w:tcPr>
+        <w:p>
+          <w:pPr>
+            <w:pStyle w:val="Header"/>
+          </w:pPr>
+          <w:r>
+            <w:rPr>
+              <w:noProof/>
+              <w:sz w:val="16"/>
+              <w:szCs w:val="16"/>
+            </w:rPr>
+            <w:drawing>
+              <wp:inline distT="0" distB="0" distL="0" distR="0" wp14:anchorId="070CBF94" wp14:editId="0F1E3C9A">
+                <wp:extent cx="326004" cy="378092"/>
+                <wp:effectExtent l="0" t="0" r="0" b="3175"/>
+                <wp:docPr id="1624938158" name="Picture 1" descr="The Site Savvy Blog - News, trends, tips, and environmental knowledge."/>
+                <wp:cNvGraphicFramePr>
+                  <a:graphicFrameLocks xmlns:a="http://schemas.openxmlformats.org/drawingml/2006/main" noChangeAspect="1"/>
+                </wp:cNvGraphicFramePr>
+                <a:graphic xmlns:a="http://schemas.openxmlformats.org/drawingml/2006/main">
+                  <a:graphicData uri="http://schemas.openxmlformats.org/drawingml/2006/picture">
+                    <pic:pic xmlns:pic="http://schemas.openxmlformats.org/drawingml/2006/picture">
+                      <pic:nvPicPr>
+                        <pic:cNvPr id="0" name="Picture 1" descr="The Site Savvy Blog - News, trends, tips, and environmental knowledge."/>
+                        <pic:cNvPicPr>
+                          <a:picLocks noChangeAspect="1" noChangeArrowheads="1"/>
+                        </pic:cNvPicPr>
+                      </pic:nvPicPr>
+                      <pic:blipFill>
+                        <a:blip r:embed="rId1">
+                          <a:extLst>
+                            <a:ext uri="{28A0092B-C50C-407E-A947-70E740481C1C}">
+                              <a14:useLocalDpi xmlns:a14="http://schemas.microsoft.com/office/drawing/2010/main" val="0"/>
+                            </a:ext>
+                          </a:extLst>
+                        </a:blip>
+                        <a:srcRect/>
+                        <a:stretch>
+                          <a:fillRect/>
+                        </a:stretch>
+                      </pic:blipFill>
+                      <pic:spPr bwMode="auto">
+                        <a:xfrm rot="10800000" flipH="1" flipV="1">
+                          <a:off x="0" y="0"/>
+                          <a:ext cx="326004" cy="378092"/>
+                        </a:xfrm>
+                        <a:prstGeom prst="rect">
+                          <a:avLst/>
+                        </a:prstGeom>
+                        <a:noFill/>
+                        <a:ln>
+                          <a:noFill/>
+                        </a:ln>
+                      </pic:spPr>
+                    </pic:pic>
+                  </a:graphicData>
+                </a:graphic>
+              </wp:inline>
+            </w:drawing>
+          </w:r>
+        </w:p>
+      </w:tc>
+    </w:tr>
+  </w:tbl>
+  <w:p>
+    <w:pPr>
+      <w:pStyle w:val="Header"/>
+      <w:rPr>
+        <w:sz w:val="16"/>
+        <w:szCs w:val="16"/>
+      </w:rPr>
+    </w:pPr>
+  </w:p>
+</w:hdr>
+</file>
+
+<file path=word/header8.xml><?xml version="1.0" encoding="utf-8"?>
+<w:hdr xmlns:wpc="http://schemas.microsoft.com/office/word/2010/wordprocessingCanvas" xmlns:cx="http://schemas.microsoft.com/office/drawing/2014/chartex" xmlns:cx1="http://schemas.microsoft.com/office/drawing/2015/9/8/chartex" xmlns:cx2="http://schemas.microsoft.com/office/drawing/2015/10/21/chartex" xmlns:cx3="http://schemas.microsoft.com/office/drawing/2016/5/9/chartex" xmlns:cx4="http://schemas.microsoft.com/office/drawing/2016/5/10/chartex" xmlns:cx5="http://schemas.microsoft.com/office/drawing/2016/5/11/chartex" xmlns:cx6="http://schemas.microsoft.com/office/drawing/2016/5/12/chartex" xmlns:cx7="http://schemas.microsoft.com/office/drawing/2016/5/13/chartex" xmlns:cx8="http://schemas.microsoft.com/office/drawing/2016/5/14/chartex" xmlns:mc="http://schemas.openxmlformats.org/markup-compatibility/2006" xmlns:aink="http://schemas.microsoft.com/office/drawing/2016/ink" xmlns:am3d="http://schemas.microsoft.com/office/drawing/2017/model3d" xmlns:o="urn:schemas-microsoft-com:office:office" xmlns:oel="http://schemas.microsoft.com/office/2019/extlst" xmlns:r="http://schemas.openxmlformats.org/officeDocument/2006/relationships" xmlns:m="http://schemas.openxmlformats.org/officeDocument/2006/math" xmlns:v="urn:schemas-microsoft-com:vml" xmlns:wp14="http://schemas.microsoft.com/office/word/2010/wordprocessingDrawing" xmlns:wp="http://schemas.openxmlformats.org/drawingml/2006/wordprocessingDrawing" xmlns:w10="urn:schemas-microsoft-com:office:word" xmlns:w="http://schemas.openxmlformats.org/wordprocessingml/2006/main" xmlns:w14="http://schemas.microsoft.com/office/word/2010/wordml" xmlns:w15="http://schemas.microsoft.com/office/word/2012/wordml" xmlns:w16cex="http://schemas.microsoft.com/office/word/2018/wordml/cex" xmlns:w16cid="http://schemas.microsoft.com/office/word/2016/wordml/cid" xmlns:w16="http://schemas.microsoft.com/office/word/2018/wordml" xmlns:w16du="http://schemas.microsoft.com/office/word/2023/wordml/word16du" xmlns:w16sdtdh="http://schemas.microsoft.com/office/word/2020/wordml/sdtdatahash" xmlns:w16sdtfl="http://schemas.microsoft.com/office/word/2024/wordml/sdtformatlock" xmlns:w16se="http://schemas.microsoft.com/office/word/2015/wordml/symex" xmlns:wpg="http://schemas.microsoft.com/office/word/2010/wordprocessingGroup" xmlns:wpi="http://schemas.microsoft.com/office/word/2010/wordprocessingInk" xmlns:wne="http://schemas.microsoft.com/office/word/2006/wordml" xmlns:wps="http://schemas.microsoft.com/office/word/2010/wordprocessingShape" mc:Ignorable="w14 w15 w16se w16cid w16 w16cex w16sdtdh w16sdtfl w16du wp14">
+  <w:tbl>
+    <w:tblPr>
+      <w:tblStyle w:val="TableGrid"/>
+      <w:tblW w:w="0" w:type="auto"/>
+      <w:tblBorders>
+        <w:top w:val="none" w:sz="0" w:space="0" w:color="auto"/>
+        <w:left w:val="none" w:sz="0" w:space="0" w:color="auto"/>
+        <w:bottom w:val="none" w:sz="0" w:space="0" w:color="auto"/>
+        <w:right w:val="none" w:sz="0" w:space="0" w:color="auto"/>
+        <w:insideH w:val="none" w:sz="0" w:space="0" w:color="auto"/>
+        <w:insideV w:val="none" w:sz="0" w:space="0" w:color="auto"/>
+      </w:tblBorders>
+      <w:tblLook w:val="04A0" w:firstRow="1" w:lastRow="0" w:firstColumn="1" w:lastColumn="0" w:noHBand="0" w:noVBand="1"/>
+    </w:tblPr>
+    <w:tblGrid>
+      <w:gridCol w:w="9811"/>
+      <w:gridCol w:w="729"/>
+    </w:tblGrid>
+    <w:tr>
+      <w:tc>
+        <w:tcPr>
+          <w:tcW w:w="9895" w:type="dxa"/>
+        </w:tcPr>
+        <w:p>
+          <w:pPr>
+            <w:pStyle w:val="Header"/>
+            <w:rPr>
+              <w:sz w:val="16"/>
+              <w:szCs w:val="16"/>
+            </w:rPr>
+          </w:pPr>
+          <w:r>
+            <w:rPr>
+              <w:sz w:val="16"/>
+              <w:szCs w:val="16"/>
+            </w:rPr>
+            <w:t>ZSight –</w:t>
+          </w:r>
+          <w:r>
+            <w:rPr>
+              <w:sz w:val="16"/>
+              <w:szCs w:val="16"/>
+            </w:rPr>
+            <w:t xml:space="preserve"> </w:t>
+          </w:r>
+          <w:r>
+            <w:rPr>
+              <w:sz w:val="16"/>
+              <w:szCs w:val="16"/>
+            </w:rPr>
+            <w:t>Device Replacement on an Existing Container</w:t>
+          </w:r>
+        </w:p>
+      </w:tc>
+      <w:tc>
+        <w:tcPr>
+          <w:tcW w:w="635" w:type="dxa"/>
+        </w:tcPr>
+        <w:p>
+          <w:pPr>
+            <w:pStyle w:val="Header"/>
+          </w:pPr>
+          <w:r>
+            <w:rPr>
+              <w:noProof/>
+              <w:sz w:val="16"/>
+              <w:szCs w:val="16"/>
+            </w:rPr>
+            <w:drawing>
+              <wp:inline distT="0" distB="0" distL="0" distR="0" wp14:anchorId="4EE4EE26" wp14:editId="3F90F5A8">
+                <wp:extent cx="326004" cy="378092"/>
+                <wp:effectExtent l="0" t="0" r="0" b="3175"/>
+                <wp:docPr id="494796397" name="Picture 1" descr="The Site Savvy Blog - News, trends, tips, and environmental knowledge."/>
+                <wp:cNvGraphicFramePr>
+                  <a:graphicFrameLocks xmlns:a="http://schemas.openxmlformats.org/drawingml/2006/main" noChangeAspect="1"/>
+                </wp:cNvGraphicFramePr>
+                <a:graphic xmlns:a="http://schemas.openxmlformats.org/drawingml/2006/main">
+                  <a:graphicData uri="http://schemas.openxmlformats.org/drawingml/2006/picture">
+                    <pic:pic xmlns:pic="http://schemas.openxmlformats.org/drawingml/2006/picture">
+                      <pic:nvPicPr>
+                        <pic:cNvPr id="0" name="Picture 1" descr="The Site Savvy Blog - News, trends, tips, and environmental knowledge."/>
+                        <pic:cNvPicPr>
+                          <a:picLocks noChangeAspect="1" noChangeArrowheads="1"/>
+                        </pic:cNvPicPr>
+                      </pic:nvPicPr>
+                      <pic:blipFill>
+                        <a:blip r:embed="rId1">
+                          <a:extLst>
+                            <a:ext uri="{28A0092B-C50C-407E-A947-70E740481C1C}">
+                              <a14:useLocalDpi xmlns:a14="http://schemas.microsoft.com/office/drawing/2010/main" val="0"/>
+                            </a:ext>
+                          </a:extLst>
+                        </a:blip>
+                        <a:srcRect/>
+                        <a:stretch>
+                          <a:fillRect/>
+                        </a:stretch>
+                      </pic:blipFill>
+                      <pic:spPr bwMode="auto">
+                        <a:xfrm rot="10800000" flipH="1" flipV="1">
+                          <a:off x="0" y="0"/>
+                          <a:ext cx="326004" cy="378092"/>
+                        </a:xfrm>
+                        <a:prstGeom prst="rect">
+                          <a:avLst/>
+                        </a:prstGeom>
+                        <a:noFill/>
+                        <a:ln>
+                          <a:noFill/>
+                        </a:ln>
+                      </pic:spPr>
+                    </pic:pic>
+                  </a:graphicData>
+                </a:graphic>
+              </wp:inline>
+            </w:drawing>
+          </w:r>
+        </w:p>
+      </w:tc>
+    </w:tr>
+  </w:tbl>
+  <w:p>
+    <w:pPr>
+      <w:pStyle w:val="Header"/>
+      <w:rPr>
+        <w:sz w:val="16"/>
+        <w:szCs w:val="16"/>
+      </w:rPr>
+    </w:pPr>
+  </w:p>
+</w:hdr>
+</file>
+
+<file path=word/header9.xml><?xml version="1.0" encoding="utf-8"?>
+<w:hdr xmlns:wpc="http://schemas.microsoft.com/office/word/2010/wordprocessingCanvas" xmlns:cx="http://schemas.microsoft.com/office/drawing/2014/chartex" xmlns:cx1="http://schemas.microsoft.com/office/drawing/2015/9/8/chartex" xmlns:cx2="http://schemas.microsoft.com/office/drawing/2015/10/21/chartex" xmlns:cx3="http://schemas.microsoft.com/office/drawing/2016/5/9/chartex" xmlns:cx4="http://schemas.microsoft.com/office/drawing/2016/5/10/chartex" xmlns:cx5="http://schemas.microsoft.com/office/drawing/2016/5/11/chartex" xmlns:cx6="http://schemas.microsoft.com/office/drawing/2016/5/12/chartex" xmlns:cx7="http://schemas.microsoft.com/office/drawing/2016/5/13/chartex" xmlns:cx8="http://schemas.microsoft.com/office/drawing/2016/5/14/chartex" xmlns:mc="http://schemas.openxmlformats.org/markup-compatibility/2006" xmlns:aink="http://schemas.microsoft.com/office/drawing/2016/ink" xmlns:am3d="http://schemas.microsoft.com/office/drawing/2017/model3d" xmlns:o="urn:schemas-microsoft-com:office:office" xmlns:oel="http://schemas.microsoft.com/office/2019/extlst" xmlns:r="http://schemas.openxmlformats.org/officeDocument/2006/relationships" xmlns:m="http://schemas.openxmlformats.org/officeDocument/2006/math" xmlns:v="urn:schemas-microsoft-com:vml" xmlns:wp14="http://schemas.microsoft.com/office/word/2010/wordprocessingDrawing" xmlns:wp="http://schemas.openxmlformats.org/drawingml/2006/wordprocessingDrawing" xmlns:w10="urn:schemas-microsoft-com:office:word" xmlns:w="http://schemas.openxmlformats.org/wordprocessingml/2006/main" xmlns:w14="http://schemas.microsoft.com/office/word/2010/wordml" xmlns:w15="http://schemas.microsoft.com/office/word/2012/wordml" xmlns:w16cex="http://schemas.microsoft.com/office/word/2018/wordml/cex" xmlns:w16cid="http://schemas.microsoft.com/office/word/2016/wordml/cid" xmlns:w16="http://schemas.microsoft.com/office/word/2018/wordml" xmlns:w16du="http://schemas.microsoft.com/office/word/2023/wordml/word16du" xmlns:w16sdtdh="http://schemas.microsoft.com/office/word/2020/wordml/sdtdatahash" xmlns:w16sdtfl="http://schemas.microsoft.com/office/word/2024/wordml/sdtformatlock" xmlns:w16se="http://schemas.microsoft.com/office/word/2015/wordml/symex" xmlns:wpg="http://schemas.microsoft.com/office/word/2010/wordprocessingGroup" xmlns:wpi="http://schemas.microsoft.com/office/word/2010/wordprocessingInk" xmlns:wne="http://schemas.microsoft.com/office/word/2006/wordml" xmlns:wps="http://schemas.microsoft.com/office/word/2010/wordprocessingShape" mc:Ignorable="w14 w15 w16se w16cid w16 w16cex w16sdtdh w16sdtfl w16du wp14">
+  <w:tbl>
+    <w:tblPr>
+      <w:tblStyle w:val="TableGrid"/>
+      <w:tblW w:w="0" w:type="auto"/>
+      <w:tblBorders>
+        <w:top w:val="none" w:sz="0" w:space="0" w:color="auto"/>
+        <w:left w:val="none" w:sz="0" w:space="0" w:color="auto"/>
+        <w:bottom w:val="none" w:sz="0" w:space="0" w:color="auto"/>
+        <w:right w:val="none" w:sz="0" w:space="0" w:color="auto"/>
+        <w:insideH w:val="none" w:sz="0" w:space="0" w:color="auto"/>
+        <w:insideV w:val="none" w:sz="0" w:space="0" w:color="auto"/>
+      </w:tblBorders>
+      <w:tblLook w:val="04A0" w:firstRow="1" w:lastRow="0" w:firstColumn="1" w:lastColumn="0" w:noHBand="0" w:noVBand="1"/>
+    </w:tblPr>
+    <w:tblGrid>
+      <w:gridCol w:w="9811"/>
+      <w:gridCol w:w="729"/>
+    </w:tblGrid>
+    <w:tr>
+      <w:tc>
+        <w:tcPr>
+          <w:tcW w:w="9895" w:type="dxa"/>
+        </w:tcPr>
+        <w:p>
+          <w:pPr>
+            <w:pStyle w:val="Header"/>
+            <w:rPr>
+              <w:sz w:val="16"/>
+              <w:szCs w:val="16"/>
+            </w:rPr>
+          </w:pPr>
+          <w:r>
+            <w:rPr>
+              <w:sz w:val="16"/>
+              <w:szCs w:val="16"/>
+            </w:rPr>
+            <w:t>ZSight –</w:t>
+          </w:r>
+          <w:r>
+            <w:rPr>
+              <w:sz w:val="16"/>
+              <w:szCs w:val="16"/>
+            </w:rPr>
+            <w:t xml:space="preserve"> </w:t>
+          </w:r>
+          <w:r>
+            <w:rPr>
+              <w:sz w:val="16"/>
+              <w:szCs w:val="16"/>
+            </w:rPr>
+            <w:t>Ongoing Entity Updates</w:t>
+          </w:r>
+        </w:p>
+      </w:tc>
+      <w:tc>
+        <w:tcPr>
+          <w:tcW w:w="635" w:type="dxa"/>
+        </w:tcPr>
+        <w:p>
+          <w:pPr>
+            <w:pStyle w:val="Header"/>
+          </w:pPr>
+          <w:r>
+            <w:rPr>
+              <w:noProof/>
+              <w:sz w:val="16"/>
+              <w:szCs w:val="16"/>
+            </w:rPr>
+            <w:drawing>
+              <wp:inline distT="0" distB="0" distL="0" distR="0" wp14:anchorId="7E737B12" wp14:editId="2F4556F4">
+                <wp:extent cx="326004" cy="378092"/>
+                <wp:effectExtent l="0" t="0" r="0" b="3175"/>
+                <wp:docPr id="384233961" name="Picture 1" descr="The Site Savvy Blog - News, trends, tips, and environmental knowledge."/>
                 <wp:cNvGraphicFramePr>
                   <a:graphicFrameLocks xmlns:a="http://schemas.openxmlformats.org/drawingml/2006/main" noChangeAspect="1"/>
                 </wp:cNvGraphicFramePr>
@@ -14741,7 +17666,7 @@
   <w:style w:type="paragraph" w:default="1" w:styleId="Normal">
     <w:name w:val="Normal"/>
     <w:qFormat/>
-    <w:rsid w:val="005B0D61"/>
+    <w:rsid w:val="007B5D0E"/>
   </w:style>
   <w:style w:type="paragraph" w:styleId="Heading1">
     <w:name w:val="heading 1"/>

</xml_diff>